<commit_message>
RCF padrão SGS: logos SGS e AXIA lado a lado no cabeçalho
Corrige corte do logo do cliente e quebra do bloco de controle no PDF,
estende o filete laranja sob todo o cabeçalho.

Co-Authored-By: Claude Opus 5.5 <noreply@anthropic.com>
Claude-Session: https://claude.ai/code/session_012WTuzpchRfoPVn4CU6YUC5
</commit_message>
<xml_diff>
--- a/modelos/RCF_Padrao_SGS_AXIA_modelo.docx
+++ b/modelos/RCF_Padrao_SGS_AXIA_modelo.docx
@@ -2,6 +2,16 @@
 <file path=word/document.xml><?xml version="1.0" encoding="utf-8"?>
 <w:document xmlns:wpc="http://schemas.microsoft.com/office/word/2010/wordprocessingCanvas" xmlns:mo="http://schemas.microsoft.com/office/mac/office/2008/main" xmlns:mc="http://schemas.openxmlformats.org/markup-compatibility/2006" xmlns:mv="urn:schemas-microsoft-com:mac:vml" xmlns:o="urn:schemas-microsoft-com:office:office" xmlns:r="http://schemas.openxmlformats.org/officeDocument/2006/relationships" xmlns:m="http://schemas.openxmlformats.org/officeDocument/2006/math" xmlns:v="urn:schemas-microsoft-com:vml" xmlns:wp14="http://schemas.microsoft.com/office/word/2010/wordprocessingDrawing" xmlns:wp="http://schemas.openxmlformats.org/drawingml/2006/wordprocessingDrawing" xmlns:w10="urn:schemas-microsoft-com:office:word" xmlns:w="http://schemas.openxmlformats.org/wordprocessingml/2006/main" xmlns:w14="http://schemas.microsoft.com/office/word/2010/wordml" xmlns:wpg="http://schemas.microsoft.com/office/word/2010/wordprocessingGroup" xmlns:wpi="http://schemas.microsoft.com/office/word/2010/wordprocessingInk" xmlns:wne="http://schemas.microsoft.com/office/word/2006/wordml" xmlns:wps="http://schemas.microsoft.com/office/word/2010/wordprocessingShape" mc:Ignorable="w14 wp14">
   <w:body>
+    <w:p>
+      <w:pPr>
+        <w:spacing w:after="0" w:before="0"/>
+      </w:pPr>
+      <w:r>
+        <w:rPr>
+          <w:sz w:val="8"/>
+        </w:rPr>
+      </w:r>
+    </w:p>
     <w:tbl>
       <w:tblPr>
         <w:tblW w:type="dxa" w:w="9639"/>
@@ -8559,26 +8569,23 @@
       <w:tblLayout w:type="fixed"/>
     </w:tblPr>
     <w:tblGrid>
-      <w:gridCol w:w="1701"/>
-      <w:gridCol w:w="4762"/>
-      <w:gridCol w:w="1304"/>
-      <w:gridCol w:w="1871"/>
+      <w:gridCol w:w="1757"/>
+      <w:gridCol w:w="1417"/>
+      <w:gridCol w:w="3912"/>
+      <w:gridCol w:w="2551"/>
     </w:tblGrid>
     <w:tr>
       <w:tc>
         <w:tcPr>
-          <w:tcW w:type="dxa" w:w="1701"/>
+          <w:tcW w:type="dxa" w:w="1757"/>
           <w:vMerge w:val="restart"/>
           <w:vAlign w:val="center"/>
-          <w:tcBorders>
-            <w:bottom w:val="single" w:sz="18" w:color="F69138"/>
-          </w:tcBorders>
         </w:tcPr>
         <w:p>
           <w:r>
             <w:drawing>
               <wp:inline xmlns:a="http://schemas.openxmlformats.org/drawingml/2006/main" xmlns:pic="http://schemas.openxmlformats.org/drawingml/2006/picture">
-                <wp:extent cx="1080000" cy="504000"/>
+                <wp:extent cx="964286" cy="450000"/>
                 <wp:docPr id="1" name="Picture 1"/>
                 <wp:cNvGraphicFramePr>
                   <a:graphicFrameLocks noChangeAspect="1"/>
@@ -8599,7 +8606,7 @@
                       <pic:spPr>
                         <a:xfrm>
                           <a:off x="0" y="0"/>
-                          <a:ext cx="1080000" cy="504000"/>
+                          <a:ext cx="964286" cy="450000"/>
                         </a:xfrm>
                         <a:prstGeom prst="rect"/>
                       </pic:spPr>
@@ -8613,50 +8620,13 @@
       </w:tc>
       <w:tc>
         <w:tcPr>
-          <w:tcW w:type="dxa" w:w="4762"/>
+          <w:tcW w:type="dxa" w:w="1417"/>
           <w:vMerge w:val="restart"/>
+          <w:tcBorders>
+            <w:left w:val="single" w:sz="8" w:color="C9CACC"/>
+            <w:right w:val="single" w:sz="8" w:color="C9CACC"/>
+          </w:tcBorders>
           <w:vAlign w:val="center"/>
-          <w:tcBorders>
-            <w:bottom w:val="single" w:sz="18" w:color="F69138"/>
-          </w:tcBorders>
-        </w:tcPr>
-        <w:p>
-          <w:pPr>
-            <w:spacing w:after="0" w:before="0"/>
-          </w:pPr>
-          <w:r>
-            <w:rPr>
-              <w:b w:val="0"/>
-              <w:i w:val="0"/>
-              <w:color w:val="5F6064"/>
-              <w:sz w:val="14"/>
-            </w:rPr>
-            <w:t>INSPEÇÃO EM FÁBRICA</w:t>
-          </w:r>
-        </w:p>
-        <w:p>
-          <w:pPr>
-            <w:spacing w:after="0" w:before="0"/>
-          </w:pPr>
-          <w:r>
-            <w:rPr>
-              <w:b/>
-              <w:i w:val="0"/>
-              <w:color w:val="2B2C2E"/>
-              <w:sz w:val="23"/>
-            </w:rPr>
-            <w:t>RCF – RELATÓRIO DE CONTROLE NA FÁBRICA</w:t>
-          </w:r>
-        </w:p>
-      </w:tc>
-      <w:tc>
-        <w:tcPr>
-          <w:tcW w:type="dxa" w:w="1304"/>
-          <w:vMerge w:val="restart"/>
-          <w:vAlign w:val="center"/>
-          <w:tcBorders>
-            <w:bottom w:val="single" w:sz="18" w:color="F69138"/>
-          </w:tcBorders>
         </w:tcPr>
         <w:p>
           <w:pPr>
@@ -8665,7 +8635,7 @@
           <w:r>
             <w:drawing>
               <wp:inline xmlns:a="http://schemas.openxmlformats.org/drawingml/2006/main" xmlns:pic="http://schemas.openxmlformats.org/drawingml/2006/picture">
-                <wp:extent cx="684000" cy="413778"/>
+                <wp:extent cx="684366" cy="413999"/>
                 <wp:docPr id="2" name="Picture 2"/>
                 <wp:cNvGraphicFramePr>
                   <a:graphicFrameLocks noChangeAspect="1"/>
@@ -8686,7 +8656,7 @@
                       <pic:spPr>
                         <a:xfrm>
                           <a:off x="0" y="0"/>
-                          <a:ext cx="684000" cy="413778"/>
+                          <a:ext cx="684366" cy="413999"/>
                         </a:xfrm>
                         <a:prstGeom prst="rect"/>
                       </pic:spPr>
@@ -8700,7 +8670,59 @@
       </w:tc>
       <w:tc>
         <w:tcPr>
-          <w:tcW w:type="dxa" w:w="1871"/>
+          <w:tcW w:type="dxa" w:w="3912"/>
+          <w:vMerge w:val="restart"/>
+          <w:vAlign w:val="center"/>
+        </w:tcPr>
+        <w:p>
+          <w:pPr>
+            <w:spacing w:after="0" w:before="0"/>
+            <w:ind w:left="113"/>
+          </w:pPr>
+          <w:r>
+            <w:rPr>
+              <w:b w:val="0"/>
+              <w:i w:val="0"/>
+              <w:color w:val="5F6064"/>
+              <w:sz w:val="14"/>
+            </w:rPr>
+            <w:t>INSPEÇÃO EM FÁBRICA</w:t>
+          </w:r>
+        </w:p>
+        <w:p>
+          <w:pPr>
+            <w:spacing w:after="0" w:before="0"/>
+            <w:ind w:left="113"/>
+          </w:pPr>
+          <w:r>
+            <w:rPr>
+              <w:b/>
+              <w:i w:val="0"/>
+              <w:color w:val="2B2C2E"/>
+              <w:sz w:val="22"/>
+            </w:rPr>
+            <w:t>RCF – Relatório de Controle</w:t>
+          </w:r>
+        </w:p>
+        <w:p>
+          <w:pPr>
+            <w:spacing w:after="0" w:before="0"/>
+            <w:ind w:left="113"/>
+          </w:pPr>
+          <w:r>
+            <w:rPr>
+              <w:b/>
+              <w:i w:val="0"/>
+              <w:color w:val="2B2C2E"/>
+              <w:sz w:val="22"/>
+            </w:rPr>
+            <w:t>na Fábrica</w:t>
+          </w:r>
+        </w:p>
+      </w:tc>
+      <w:tc>
+        <w:tcPr>
+          <w:tcW w:type="dxa" w:w="2551"/>
           <w:shd w:val="clear" w:color="auto" w:fill="76777A"/>
         </w:tcPr>
         <w:p>
@@ -8712,7 +8734,7 @@
               <w:b/>
               <w:i w:val="0"/>
               <w:color w:val="FFFFFF"/>
-              <w:sz w:val="17"/>
+              <w:sz w:val="16"/>
             </w:rPr>
             <w:t>Nº RCF-[SIGLA]-[0000]-[AAAA]</w:t>
           </w:r>
@@ -8722,28 +8744,37 @@
     <w:tr>
       <w:tc>
         <w:tcPr>
-          <w:tcW w:type="dxa" w:w="1701"/>
+          <w:tcW w:type="dxa" w:w="1757"/>
           <w:vMerge/>
+          <w:tcBorders>
+            <w:bottom w:val="single" w:sz="18" w:color="F69138"/>
+          </w:tcBorders>
         </w:tcPr>
         <w:p/>
       </w:tc>
       <w:tc>
         <w:tcPr>
-          <w:tcW w:type="dxa" w:w="4762"/>
+          <w:tcW w:type="dxa" w:w="1417"/>
           <w:vMerge/>
+          <w:tcBorders>
+            <w:bottom w:val="single" w:sz="18" w:color="F69138"/>
+          </w:tcBorders>
         </w:tcPr>
         <w:p/>
       </w:tc>
       <w:tc>
         <w:tcPr>
-          <w:tcW w:type="dxa" w:w="1304"/>
+          <w:tcW w:type="dxa" w:w="3912"/>
           <w:vMerge/>
+          <w:tcBorders>
+            <w:bottom w:val="single" w:sz="18" w:color="F69138"/>
+          </w:tcBorders>
         </w:tcPr>
         <w:p/>
       </w:tc>
       <w:tc>
         <w:tcPr>
-          <w:tcW w:type="dxa" w:w="1871"/>
+          <w:tcW w:type="dxa" w:w="2551"/>
           <w:tcBorders>
             <w:bottom w:val="single" w:sz="18" w:color="F69138"/>
           </w:tcBorders>
@@ -8759,7 +8790,21 @@
               <w:color w:val="5F6064"/>
               <w:sz w:val="15"/>
             </w:rPr>
-            <w:t>Rev. [00]  ·  Emissão [DD/MM/AAAA]</w:t>
+            <w:t>Rev. [00]</w:t>
+          </w:r>
+        </w:p>
+        <w:p>
+          <w:pPr>
+            <w:spacing w:after="0" w:before="0"/>
+          </w:pPr>
+          <w:r>
+            <w:rPr>
+              <w:b w:val="0"/>
+              <w:i w:val="0"/>
+              <w:color w:val="5F6064"/>
+              <w:sz w:val="15"/>
+            </w:rPr>
+            <w:t>Emissão [DD/MM/AAAA]</w:t>
           </w:r>
         </w:p>
         <w:p>

</xml_diff>

<commit_message>
RCF padrão SGS: cabeçalho e rodapé repetem nº, revisão e emissão via campos REF
Troca a vinculação a XML (que só reagia à digitação no Word) por
indicadores no quadro de identificação lidos por campos REF; o Word
atualiza os campos ao abrir o arquivo e ao gerar PDF, inclusive quando
o quadro é preenchido por ferramenta ou cópia e cola.

Co-Authored-By: Claude Opus 5.5 <noreply@anthropic.com>
Claude-Session: https://claude.ai/code/session_012WTuzpchRfoPVn4CU6YUC5
</commit_message>
<xml_diff>
--- a/modelos/RCF_Padrao_SGS_AXIA_modelo.docx
+++ b/modelos/RCF_Padrao_SGS_AXIA_modelo.docx
@@ -79,6 +79,7 @@
             <w:pPr>
               <w:spacing w:after="20"/>
             </w:pPr>
+            <w:bookmarkStart w:id="1002" w:name="RCF_NUMERO"/>
             <w:sdt>
               <w:sdtPr>
                 <w:rPr>
@@ -88,10 +89,9 @@
                 </w:rPr>
                 <w:alias w:val="Nº do relatório"/>
                 <w:tag w:val="nº_do_relatório"/>
-                <w:id w:val="1005"/>
+                <w:id w:val="1001"/>
                 <w:lock w:val="sdtLocked"/>
                 <w:showingPlcHdr/>
-                <w:dataBinding w:prefixMappings="xmlns:ns0='urn:sgs:rcf'" w:xpath="/ns0:rcf[1]/ns0:numero[1]" w:storeItemID="{6C3C8BC8-F283-45AE-878A-BAB7291924A1}"/>
                 <w:text/>
               </w:sdtPr>
               <w:sdtContent>
@@ -106,6 +106,7 @@
                 </w:r>
               </w:sdtContent>
             </w:sdt>
+            <w:bookmarkEnd w:id="1002"/>
           </w:p>
         </w:tc>
         <w:tc>
@@ -131,6 +132,7 @@
             <w:pPr>
               <w:spacing w:after="20"/>
             </w:pPr>
+            <w:bookmarkStart w:id="1004" w:name="RCF_REVISAO"/>
             <w:sdt>
               <w:sdtPr>
                 <w:rPr>
@@ -140,10 +142,9 @@
                 </w:rPr>
                 <w:alias w:val="Revisão"/>
                 <w:tag w:val="revisão"/>
-                <w:id w:val="1006"/>
+                <w:id w:val="1003"/>
                 <w:lock w:val="sdtLocked"/>
                 <w:showingPlcHdr/>
-                <w:dataBinding w:prefixMappings="xmlns:ns0='urn:sgs:rcf'" w:xpath="/ns0:rcf[1]/ns0:revisao[1]" w:storeItemID="{6C3C8BC8-F283-45AE-878A-BAB7291924A1}"/>
                 <w:text/>
               </w:sdtPr>
               <w:sdtContent>
@@ -158,6 +159,7 @@
                 </w:r>
               </w:sdtContent>
             </w:sdt>
+            <w:bookmarkEnd w:id="1004"/>
           </w:p>
         </w:tc>
         <w:tc>
@@ -183,6 +185,7 @@
             <w:pPr>
               <w:spacing w:after="20"/>
             </w:pPr>
+            <w:bookmarkStart w:id="1006" w:name="RCF_EMISSAO"/>
             <w:sdt>
               <w:sdtPr>
                 <w:rPr>
@@ -192,10 +195,9 @@
                 </w:rPr>
                 <w:alias w:val="Data de emissão"/>
                 <w:tag w:val="data_de_emissão"/>
-                <w:id w:val="1007"/>
+                <w:id w:val="1005"/>
                 <w:lock w:val="sdtLocked"/>
                 <w:showingPlcHdr/>
-                <w:dataBinding w:prefixMappings="xmlns:ns0='urn:sgs:rcf'" w:xpath="/ns0:rcf[1]/ns0:emissao[1]" w:storeItemID="{6C3C8BC8-F283-45AE-878A-BAB7291924A1}"/>
                 <w:date>
                   <w:dateFormat w:val="dd/MM/yyyy"/>
                   <w:lid w:val="pt-BR"/>
@@ -215,6 +217,7 @@
                 </w:r>
               </w:sdtContent>
             </w:sdt>
+            <w:bookmarkEnd w:id="1006"/>
           </w:p>
         </w:tc>
       </w:tr>
@@ -249,7 +252,7 @@
                 </w:rPr>
                 <w:alias w:val="Documento de aquisição"/>
                 <w:tag w:val="documento_de_aquisição"/>
-                <w:id w:val="1008"/>
+                <w:id w:val="1007"/>
                 <w:lock w:val="sdtLocked"/>
                 <w:showingPlcHdr/>
                 <w:text/>
@@ -297,7 +300,7 @@
                 </w:rPr>
                 <w:alias w:val="Item / lista de material"/>
                 <w:tag w:val="item_/_lista_de_material"/>
-                <w:id w:val="1009"/>
+                <w:id w:val="1008"/>
                 <w:lock w:val="sdtLocked"/>
                 <w:showingPlcHdr/>
                 <w:text/>
@@ -345,7 +348,7 @@
                 </w:rPr>
                 <w:alias w:val="PICQ nº"/>
                 <w:tag w:val="picq_nº"/>
-                <w:id w:val="1010"/>
+                <w:id w:val="1009"/>
                 <w:lock w:val="sdtLocked"/>
                 <w:showingPlcHdr/>
                 <w:text/>
@@ -395,7 +398,7 @@
                 </w:rPr>
                 <w:alias w:val="Empreendimento"/>
                 <w:tag w:val="empreendimento"/>
-                <w:id w:val="1011"/>
+                <w:id w:val="1010"/>
                 <w:lock w:val="sdtLocked"/>
                 <w:showingPlcHdr/>
                 <w:text/>
@@ -443,7 +446,7 @@
                 </w:rPr>
                 <w:alias w:val="Fornecedor / subfornecedor"/>
                 <w:tag w:val="fornecedor_/_subfornecedor"/>
-                <w:id w:val="1012"/>
+                <w:id w:val="1011"/>
                 <w:lock w:val="sdtLocked"/>
                 <w:showingPlcHdr/>
                 <w:text/>
@@ -491,7 +494,7 @@
                 </w:rPr>
                 <w:alias w:val="Data da inspeção"/>
                 <w:tag w:val="data_da_inspeção"/>
-                <w:id w:val="1013"/>
+                <w:id w:val="1012"/>
                 <w:lock w:val="sdtLocked"/>
                 <w:showingPlcHdr/>
                 <w:date>
@@ -547,7 +550,7 @@
                 </w:rPr>
                 <w:alias w:val="Material"/>
                 <w:tag w:val="material"/>
-                <w:id w:val="1014"/>
+                <w:id w:val="1013"/>
                 <w:lock w:val="sdtLocked"/>
                 <w:showingPlcHdr/>
                 <w:text/>
@@ -595,7 +598,7 @@
                 </w:rPr>
                 <w:alias w:val="Nº de série"/>
                 <w:tag w:val="nº_de_série"/>
-                <w:id w:val="1015"/>
+                <w:id w:val="1014"/>
                 <w:lock w:val="sdtLocked"/>
                 <w:showingPlcHdr/>
                 <w:text/>
@@ -684,7 +687,7 @@
                 </w:rPr>
                 <w:alias w:val="Situação geral"/>
                 <w:tag w:val="situação_geral"/>
-                <w:id w:val="1016"/>
+                <w:id w:val="1015"/>
                 <w:lock w:val="sdtLocked"/>
                 <w:showingPlcHdr/>
                 <w:dropDownList>
@@ -901,7 +904,7 @@
                 </w:rPr>
                 <w:alias w:val="Situação 1.1"/>
                 <w:tag w:val="situação_1.1"/>
-                <w:id w:val="1017"/>
+                <w:id w:val="1016"/>
                 <w:lock w:val="sdtLocked"/>
                 <w:showingPlcHdr/>
                 <w:dropDownList>
@@ -996,7 +999,7 @@
                 </w:rPr>
                 <w:alias w:val="Situação 1.2"/>
                 <w:tag w:val="situação_1.2"/>
-                <w:id w:val="1018"/>
+                <w:id w:val="1017"/>
                 <w:lock w:val="sdtLocked"/>
                 <w:showingPlcHdr/>
                 <w:dropDownList>
@@ -1091,7 +1094,7 @@
                 </w:rPr>
                 <w:alias w:val="Situação 1.3"/>
                 <w:tag w:val="situação_1.3"/>
-                <w:id w:val="1019"/>
+                <w:id w:val="1018"/>
                 <w:lock w:val="sdtLocked"/>
                 <w:showingPlcHdr/>
                 <w:dropDownList>
@@ -1186,7 +1189,7 @@
                 </w:rPr>
                 <w:alias w:val="Situação 1.4"/>
                 <w:tag w:val="situação_1.4"/>
-                <w:id w:val="1020"/>
+                <w:id w:val="1019"/>
                 <w:lock w:val="sdtLocked"/>
                 <w:showingPlcHdr/>
                 <w:dropDownList>
@@ -1281,7 +1284,7 @@
                 </w:rPr>
                 <w:alias w:val="Situação 1.5"/>
                 <w:tag w:val="situação_1.5"/>
-                <w:id w:val="1021"/>
+                <w:id w:val="1020"/>
                 <w:lock w:val="sdtLocked"/>
                 <w:showingPlcHdr/>
                 <w:dropDownList>
@@ -1376,7 +1379,7 @@
                 </w:rPr>
                 <w:alias w:val="Situação 1.6"/>
                 <w:tag w:val="situação_1.6"/>
-                <w:id w:val="1022"/>
+                <w:id w:val="1021"/>
                 <w:lock w:val="sdtLocked"/>
                 <w:showingPlcHdr/>
                 <w:dropDownList>
@@ -1471,7 +1474,7 @@
                 </w:rPr>
                 <w:alias w:val="Situação 1.7"/>
                 <w:tag w:val="situação_1.7"/>
-                <w:id w:val="1023"/>
+                <w:id w:val="1022"/>
                 <w:lock w:val="sdtLocked"/>
                 <w:showingPlcHdr/>
                 <w:dropDownList>
@@ -1566,7 +1569,7 @@
                 </w:rPr>
                 <w:alias w:val="Situação 1.8"/>
                 <w:tag w:val="situação_1.8"/>
-                <w:id w:val="1024"/>
+                <w:id w:val="1023"/>
                 <w:lock w:val="sdtLocked"/>
                 <w:showingPlcHdr/>
                 <w:dropDownList>
@@ -1661,7 +1664,7 @@
                 </w:rPr>
                 <w:alias w:val="Situação 1.9"/>
                 <w:tag w:val="situação_1.9"/>
-                <w:id w:val="1025"/>
+                <w:id w:val="1024"/>
                 <w:lock w:val="sdtLocked"/>
                 <w:showingPlcHdr/>
                 <w:dropDownList>
@@ -1756,7 +1759,7 @@
                 </w:rPr>
                 <w:alias w:val="Situação 1.10"/>
                 <w:tag w:val="situação_1.10"/>
-                <w:id w:val="1026"/>
+                <w:id w:val="1025"/>
                 <w:lock w:val="sdtLocked"/>
                 <w:showingPlcHdr/>
                 <w:dropDownList>
@@ -1851,7 +1854,7 @@
                 </w:rPr>
                 <w:alias w:val="Situação 1.11"/>
                 <w:tag w:val="situação_1.11"/>
-                <w:id w:val="1027"/>
+                <w:id w:val="1026"/>
                 <w:lock w:val="sdtLocked"/>
                 <w:showingPlcHdr/>
                 <w:dropDownList>
@@ -1946,7 +1949,7 @@
                 </w:rPr>
                 <w:alias w:val="Situação 1.12"/>
                 <w:tag w:val="situação_1.12"/>
-                <w:id w:val="1028"/>
+                <w:id w:val="1027"/>
                 <w:lock w:val="sdtLocked"/>
                 <w:showingPlcHdr/>
                 <w:dropDownList>
@@ -2041,7 +2044,7 @@
                 </w:rPr>
                 <w:alias w:val="Situação 1.13"/>
                 <w:tag w:val="situação_1.13"/>
-                <w:id w:val="1029"/>
+                <w:id w:val="1028"/>
                 <w:lock w:val="sdtLocked"/>
                 <w:showingPlcHdr/>
                 <w:dropDownList>
@@ -2136,7 +2139,7 @@
                 </w:rPr>
                 <w:alias w:val="Situação 1.14"/>
                 <w:tag w:val="situação_1.14"/>
-                <w:id w:val="1030"/>
+                <w:id w:val="1029"/>
                 <w:lock w:val="sdtLocked"/>
                 <w:showingPlcHdr/>
                 <w:dropDownList>
@@ -2231,7 +2234,7 @@
                 </w:rPr>
                 <w:alias w:val="Situação 1.15"/>
                 <w:tag w:val="situação_1.15"/>
-                <w:id w:val="1031"/>
+                <w:id w:val="1030"/>
                 <w:lock w:val="sdtLocked"/>
                 <w:showingPlcHdr/>
                 <w:dropDownList>
@@ -2326,7 +2329,7 @@
                 </w:rPr>
                 <w:alias w:val="Situação 1.16"/>
                 <w:tag w:val="situação_1.16"/>
-                <w:id w:val="1032"/>
+                <w:id w:val="1031"/>
                 <w:lock w:val="sdtLocked"/>
                 <w:showingPlcHdr/>
                 <w:dropDownList>
@@ -2421,7 +2424,7 @@
                 </w:rPr>
                 <w:alias w:val="Situação 1.17"/>
                 <w:tag w:val="situação_1.17"/>
-                <w:id w:val="1033"/>
+                <w:id w:val="1032"/>
                 <w:lock w:val="sdtLocked"/>
                 <w:showingPlcHdr/>
                 <w:dropDownList>
@@ -2516,7 +2519,7 @@
                 </w:rPr>
                 <w:alias w:val="Situação 1.18"/>
                 <w:tag w:val="situação_1.18"/>
-                <w:id w:val="1034"/>
+                <w:id w:val="1033"/>
                 <w:lock w:val="sdtLocked"/>
                 <w:showingPlcHdr/>
                 <w:dropDownList>
@@ -2611,7 +2614,7 @@
                 </w:rPr>
                 <w:alias w:val="Situação 1.19"/>
                 <w:tag w:val="situação_1.19"/>
-                <w:id w:val="1035"/>
+                <w:id w:val="1034"/>
                 <w:lock w:val="sdtLocked"/>
                 <w:showingPlcHdr/>
                 <w:dropDownList>
@@ -2706,7 +2709,7 @@
                 </w:rPr>
                 <w:alias w:val="Situação 1.20"/>
                 <w:tag w:val="situação_1.20"/>
-                <w:id w:val="1036"/>
+                <w:id w:val="1035"/>
                 <w:lock w:val="sdtLocked"/>
                 <w:showingPlcHdr/>
                 <w:dropDownList>
@@ -2801,7 +2804,7 @@
                 </w:rPr>
                 <w:alias w:val="Situação 1.21"/>
                 <w:tag w:val="situação_1.21"/>
-                <w:id w:val="1037"/>
+                <w:id w:val="1036"/>
                 <w:lock w:val="sdtLocked"/>
                 <w:showingPlcHdr/>
                 <w:dropDownList>
@@ -2896,7 +2899,7 @@
                 </w:rPr>
                 <w:alias w:val="Situação 1.22"/>
                 <w:tag w:val="situação_1.22"/>
-                <w:id w:val="1038"/>
+                <w:id w:val="1037"/>
                 <w:lock w:val="sdtLocked"/>
                 <w:showingPlcHdr/>
                 <w:dropDownList>
@@ -2991,7 +2994,7 @@
                 </w:rPr>
                 <w:alias w:val="Situação 1.23"/>
                 <w:tag w:val="situação_1.23"/>
-                <w:id w:val="1039"/>
+                <w:id w:val="1038"/>
                 <w:lock w:val="sdtLocked"/>
                 <w:showingPlcHdr/>
                 <w:dropDownList>
@@ -3086,7 +3089,7 @@
                 </w:rPr>
                 <w:alias w:val="Situação 1.24"/>
                 <w:tag w:val="situação_1.24"/>
-                <w:id w:val="1040"/>
+                <w:id w:val="1039"/>
                 <w:lock w:val="sdtLocked"/>
                 <w:showingPlcHdr/>
                 <w:dropDownList>
@@ -3181,7 +3184,7 @@
                 </w:rPr>
                 <w:alias w:val="Situação 1.25"/>
                 <w:tag w:val="situação_1.25"/>
-                <w:id w:val="1041"/>
+                <w:id w:val="1040"/>
                 <w:lock w:val="sdtLocked"/>
                 <w:showingPlcHdr/>
                 <w:dropDownList>
@@ -3276,7 +3279,7 @@
                 </w:rPr>
                 <w:alias w:val="Situação 1.26"/>
                 <w:tag w:val="situação_1.26"/>
-                <w:id w:val="1042"/>
+                <w:id w:val="1041"/>
                 <w:lock w:val="sdtLocked"/>
                 <w:showingPlcHdr/>
                 <w:dropDownList>
@@ -3371,7 +3374,7 @@
                 </w:rPr>
                 <w:alias w:val="Situação 1.27"/>
                 <w:tag w:val="situação_1.27"/>
-                <w:id w:val="1043"/>
+                <w:id w:val="1042"/>
                 <w:lock w:val="sdtLocked"/>
                 <w:showingPlcHdr/>
                 <w:dropDownList>
@@ -3496,7 +3499,7 @@
                 </w:rPr>
                 <w:alias w:val="Situação 2.1"/>
                 <w:tag w:val="situação_2.1"/>
-                <w:id w:val="1044"/>
+                <w:id w:val="1043"/>
                 <w:lock w:val="sdtLocked"/>
                 <w:showingPlcHdr/>
                 <w:dropDownList>
@@ -3591,7 +3594,7 @@
                 </w:rPr>
                 <w:alias w:val="Situação 2.2"/>
                 <w:tag w:val="situação_2.2"/>
-                <w:id w:val="1045"/>
+                <w:id w:val="1044"/>
                 <w:lock w:val="sdtLocked"/>
                 <w:showingPlcHdr/>
                 <w:dropDownList>
@@ -3686,7 +3689,7 @@
                 </w:rPr>
                 <w:alias w:val="Situação 2.3"/>
                 <w:tag w:val="situação_2.3"/>
-                <w:id w:val="1046"/>
+                <w:id w:val="1045"/>
                 <w:lock w:val="sdtLocked"/>
                 <w:showingPlcHdr/>
                 <w:dropDownList>
@@ -3781,7 +3784,7 @@
                 </w:rPr>
                 <w:alias w:val="Situação 2.4"/>
                 <w:tag w:val="situação_2.4"/>
-                <w:id w:val="1047"/>
+                <w:id w:val="1046"/>
                 <w:lock w:val="sdtLocked"/>
                 <w:showingPlcHdr/>
                 <w:dropDownList>
@@ -3876,7 +3879,7 @@
                 </w:rPr>
                 <w:alias w:val="Situação 2.5"/>
                 <w:tag w:val="situação_2.5"/>
-                <w:id w:val="1048"/>
+                <w:id w:val="1047"/>
                 <w:lock w:val="sdtLocked"/>
                 <w:showingPlcHdr/>
                 <w:dropDownList>
@@ -4001,7 +4004,7 @@
                 </w:rPr>
                 <w:alias w:val="Situação 3.1"/>
                 <w:tag w:val="situação_3.1"/>
-                <w:id w:val="1049"/>
+                <w:id w:val="1048"/>
                 <w:lock w:val="sdtLocked"/>
                 <w:showingPlcHdr/>
                 <w:dropDownList>
@@ -4096,7 +4099,7 @@
                 </w:rPr>
                 <w:alias w:val="Situação 3.2"/>
                 <w:tag w:val="situação_3.2"/>
-                <w:id w:val="1050"/>
+                <w:id w:val="1049"/>
                 <w:lock w:val="sdtLocked"/>
                 <w:showingPlcHdr/>
                 <w:dropDownList>
@@ -4191,7 +4194,7 @@
                 </w:rPr>
                 <w:alias w:val="Situação 3.3"/>
                 <w:tag w:val="situação_3.3"/>
-                <w:id w:val="1051"/>
+                <w:id w:val="1050"/>
                 <w:lock w:val="sdtLocked"/>
                 <w:showingPlcHdr/>
                 <w:dropDownList>
@@ -4286,7 +4289,7 @@
                 </w:rPr>
                 <w:alias w:val="Situação 3.4"/>
                 <w:tag w:val="situação_3.4"/>
-                <w:id w:val="1052"/>
+                <w:id w:val="1051"/>
                 <w:lock w:val="sdtLocked"/>
                 <w:showingPlcHdr/>
                 <w:dropDownList>
@@ -4381,7 +4384,7 @@
                 </w:rPr>
                 <w:alias w:val="Situação 3.5"/>
                 <w:tag w:val="situação_3.5"/>
-                <w:id w:val="1053"/>
+                <w:id w:val="1052"/>
                 <w:lock w:val="sdtLocked"/>
                 <w:showingPlcHdr/>
                 <w:dropDownList>
@@ -4476,7 +4479,7 @@
                 </w:rPr>
                 <w:alias w:val="Situação 3.6"/>
                 <w:tag w:val="situação_3.6"/>
-                <w:id w:val="1054"/>
+                <w:id w:val="1053"/>
                 <w:lock w:val="sdtLocked"/>
                 <w:showingPlcHdr/>
                 <w:dropDownList>
@@ -4571,7 +4574,7 @@
                 </w:rPr>
                 <w:alias w:val="Situação 3.7"/>
                 <w:tag w:val="situação_3.7"/>
-                <w:id w:val="1055"/>
+                <w:id w:val="1054"/>
                 <w:lock w:val="sdtLocked"/>
                 <w:showingPlcHdr/>
                 <w:dropDownList>
@@ -4666,7 +4669,7 @@
                 </w:rPr>
                 <w:alias w:val="Situação 3.8"/>
                 <w:tag w:val="situação_3.8"/>
-                <w:id w:val="1056"/>
+                <w:id w:val="1055"/>
                 <w:lock w:val="sdtLocked"/>
                 <w:showingPlcHdr/>
                 <w:dropDownList>
@@ -4761,7 +4764,7 @@
                 </w:rPr>
                 <w:alias w:val="Situação 3.9"/>
                 <w:tag w:val="situação_3.9"/>
-                <w:id w:val="1057"/>
+                <w:id w:val="1056"/>
                 <w:lock w:val="sdtLocked"/>
                 <w:showingPlcHdr/>
                 <w:dropDownList>
@@ -4856,7 +4859,7 @@
                 </w:rPr>
                 <w:alias w:val="Situação 3.10"/>
                 <w:tag w:val="situação_3.10"/>
-                <w:id w:val="1058"/>
+                <w:id w:val="1057"/>
                 <w:lock w:val="sdtLocked"/>
                 <w:showingPlcHdr/>
                 <w:dropDownList>
@@ -4951,7 +4954,7 @@
                 </w:rPr>
                 <w:alias w:val="Situação 3.11"/>
                 <w:tag w:val="situação_3.11"/>
-                <w:id w:val="1059"/>
+                <w:id w:val="1058"/>
                 <w:lock w:val="sdtLocked"/>
                 <w:showingPlcHdr/>
                 <w:dropDownList>
@@ -5046,7 +5049,7 @@
                 </w:rPr>
                 <w:alias w:val="Situação 3.12"/>
                 <w:tag w:val="situação_3.12"/>
-                <w:id w:val="1060"/>
+                <w:id w:val="1059"/>
                 <w:lock w:val="sdtLocked"/>
                 <w:showingPlcHdr/>
                 <w:dropDownList>
@@ -5171,7 +5174,7 @@
                 </w:rPr>
                 <w:alias w:val="Situação 4.1"/>
                 <w:tag w:val="situação_4.1"/>
-                <w:id w:val="1061"/>
+                <w:id w:val="1060"/>
                 <w:lock w:val="sdtLocked"/>
                 <w:showingPlcHdr/>
                 <w:dropDownList>
@@ -5266,7 +5269,7 @@
                 </w:rPr>
                 <w:alias w:val="Situação 4.2"/>
                 <w:tag w:val="situação_4.2"/>
-                <w:id w:val="1062"/>
+                <w:id w:val="1061"/>
                 <w:lock w:val="sdtLocked"/>
                 <w:showingPlcHdr/>
                 <w:dropDownList>
@@ -5361,7 +5364,7 @@
                 </w:rPr>
                 <w:alias w:val="Situação 4.3"/>
                 <w:tag w:val="situação_4.3"/>
-                <w:id w:val="1063"/>
+                <w:id w:val="1062"/>
                 <w:lock w:val="sdtLocked"/>
                 <w:showingPlcHdr/>
                 <w:dropDownList>
@@ -5456,7 +5459,7 @@
                 </w:rPr>
                 <w:alias w:val="Situação 4.4"/>
                 <w:tag w:val="situação_4.4"/>
-                <w:id w:val="1064"/>
+                <w:id w:val="1063"/>
                 <w:lock w:val="sdtLocked"/>
                 <w:showingPlcHdr/>
                 <w:dropDownList>
@@ -5581,7 +5584,7 @@
                 </w:rPr>
                 <w:alias w:val="Situação 5.1"/>
                 <w:tag w:val="situação_5.1"/>
-                <w:id w:val="1065"/>
+                <w:id w:val="1064"/>
                 <w:lock w:val="sdtLocked"/>
                 <w:showingPlcHdr/>
                 <w:dropDownList>
@@ -5676,7 +5679,7 @@
                 </w:rPr>
                 <w:alias w:val="Situação 5.2"/>
                 <w:tag w:val="situação_5.2"/>
-                <w:id w:val="1066"/>
+                <w:id w:val="1065"/>
                 <w:lock w:val="sdtLocked"/>
                 <w:showingPlcHdr/>
                 <w:dropDownList>
@@ -5849,7 +5852,7 @@
           </w:rPr>
           <w:alias w:val="Convocação nº"/>
           <w:tag w:val="convocação_nº"/>
-          <w:id w:val="1067"/>
+          <w:id w:val="1066"/>
           <w:lock w:val="sdtLocked"/>
           <w:showingPlcHdr/>
           <w:text/>
@@ -5882,7 +5885,7 @@
           </w:rPr>
           <w:alias w:val="Data da convocação"/>
           <w:tag w:val="data_da_convocação"/>
-          <w:id w:val="1068"/>
+          <w:id w:val="1067"/>
           <w:lock w:val="sdtLocked"/>
           <w:showingPlcHdr/>
           <w:date>
@@ -5920,7 +5923,7 @@
           </w:rPr>
           <w:alias w:val="Tipo de ensaio"/>
           <w:tag w:val="tipo_de_ensaio"/>
-          <w:id w:val="1069"/>
+          <w:id w:val="1068"/>
           <w:lock w:val="sdtLocked"/>
           <w:showingPlcHdr/>
           <w:comboBox>
@@ -6144,7 +6147,7 @@
                 </w:rPr>
                 <w:alias w:val="Código do PICQ"/>
                 <w:tag w:val="código_do_picq"/>
-                <w:id w:val="1070"/>
+                <w:id w:val="1069"/>
                 <w:lock w:val="sdtLocked"/>
                 <w:showingPlcHdr/>
                 <w:text/>
@@ -6199,7 +6202,7 @@
                 </w:rPr>
                 <w:alias w:val="Rev. PICQ"/>
                 <w:tag w:val="rev._picq"/>
-                <w:id w:val="1071"/>
+                <w:id w:val="1070"/>
                 <w:lock w:val="sdtLocked"/>
                 <w:showingPlcHdr/>
                 <w:text/>
@@ -6239,7 +6242,7 @@
                 </w:rPr>
                 <w:alias w:val="Norma ABNT / IEC"/>
                 <w:tag w:val="norma_abnt_/_iec"/>
-                <w:id w:val="1072"/>
+                <w:id w:val="1071"/>
                 <w:lock w:val="sdtLocked"/>
                 <w:showingPlcHdr/>
                 <w:text/>
@@ -6274,7 +6277,7 @@
                 </w:rPr>
                 <w:alias w:val="Título da norma"/>
                 <w:tag w:val="título_da_norma"/>
-                <w:id w:val="1073"/>
+                <w:id w:val="1072"/>
                 <w:lock w:val="sdtLocked"/>
                 <w:showingPlcHdr/>
                 <w:text/>
@@ -6309,7 +6312,7 @@
                 </w:rPr>
                 <w:alias w:val="Ano norma"/>
                 <w:tag w:val="ano_norma"/>
-                <w:id w:val="1074"/>
+                <w:id w:val="1073"/>
                 <w:lock w:val="sdtLocked"/>
                 <w:showingPlcHdr/>
                 <w:text/>
@@ -6349,7 +6352,7 @@
                 </w:rPr>
                 <w:alias w:val="ET do cliente"/>
                 <w:tag w:val="et_do_cliente"/>
-                <w:id w:val="1075"/>
+                <w:id w:val="1074"/>
                 <w:lock w:val="sdtLocked"/>
                 <w:showingPlcHdr/>
                 <w:text/>
@@ -6384,7 +6387,7 @@
                 </w:rPr>
                 <w:alias w:val="Título ET"/>
                 <w:tag w:val="título_et"/>
-                <w:id w:val="1076"/>
+                <w:id w:val="1075"/>
                 <w:lock w:val="sdtLocked"/>
                 <w:showingPlcHdr/>
                 <w:text/>
@@ -6419,7 +6422,7 @@
                 </w:rPr>
                 <w:alias w:val="Rev. ET"/>
                 <w:tag w:val="rev._et"/>
-                <w:id w:val="1077"/>
+                <w:id w:val="1076"/>
                 <w:lock w:val="sdtLocked"/>
                 <w:showingPlcHdr/>
                 <w:text/>
@@ -6459,7 +6462,7 @@
                 </w:rPr>
                 <w:alias w:val="Desenho / lista de materiais"/>
                 <w:tag w:val="desenho_/_lista_de_materiais"/>
-                <w:id w:val="1078"/>
+                <w:id w:val="1077"/>
                 <w:lock w:val="sdtLocked"/>
                 <w:showingPlcHdr/>
                 <w:text/>
@@ -6494,7 +6497,7 @@
                 </w:rPr>
                 <w:alias w:val="Título desenho"/>
                 <w:tag w:val="título_desenho"/>
-                <w:id w:val="1079"/>
+                <w:id w:val="1078"/>
                 <w:lock w:val="sdtLocked"/>
                 <w:showingPlcHdr/>
                 <w:text/>
@@ -6529,7 +6532,7 @@
                 </w:rPr>
                 <w:alias w:val="Rev. desenho"/>
                 <w:tag w:val="rev._desenho"/>
-                <w:id w:val="1080"/>
+                <w:id w:val="1079"/>
                 <w:lock w:val="sdtLocked"/>
                 <w:showingPlcHdr/>
                 <w:text/>
@@ -6742,7 +6745,7 @@
                 </w:rPr>
                 <w:alias w:val="Descrição do equipamento"/>
                 <w:tag w:val="descrição_do_equipamento"/>
-                <w:id w:val="1081"/>
+                <w:id w:val="1080"/>
                 <w:lock w:val="sdtLocked"/>
                 <w:showingPlcHdr/>
                 <w:text/>
@@ -6777,7 +6780,7 @@
                 </w:rPr>
                 <w:alias w:val="Nº de série"/>
                 <w:tag w:val="nº_de_série"/>
-                <w:id w:val="1082"/>
+                <w:id w:val="1081"/>
                 <w:lock w:val="sdtLocked"/>
                 <w:showingPlcHdr/>
                 <w:text/>
@@ -6812,7 +6815,7 @@
                 </w:rPr>
                 <w:alias w:val="Qtd."/>
                 <w:tag w:val="qtd."/>
-                <w:id w:val="1083"/>
+                <w:id w:val="1082"/>
                 <w:lock w:val="sdtLocked"/>
                 <w:showingPlcHdr/>
                 <w:text/>
@@ -7066,7 +7069,7 @@
                 </w:rPr>
                 <w:alias w:val="Pendência 1"/>
                 <w:tag w:val="pendência_1"/>
-                <w:id w:val="1084"/>
+                <w:id w:val="1083"/>
                 <w:lock w:val="sdtLocked"/>
                 <w:showingPlcHdr/>
                 <w:text/>
@@ -7101,7 +7104,7 @@
                 </w:rPr>
                 <w:alias w:val="Responsável 1"/>
                 <w:tag w:val="responsável_1"/>
-                <w:id w:val="1085"/>
+                <w:id w:val="1084"/>
                 <w:lock w:val="sdtLocked"/>
                 <w:showingPlcHdr/>
                 <w:text/>
@@ -7137,7 +7140,7 @@
                 </w:rPr>
                 <w:alias w:val="Status pendência"/>
                 <w:tag w:val="status_pendência"/>
-                <w:id w:val="1086"/>
+                <w:id w:val="1085"/>
                 <w:lock w:val="sdtLocked"/>
                 <w:showingPlcHdr/>
                 <w:dropDownList>
@@ -7203,7 +7206,7 @@
                 </w:rPr>
                 <w:alias w:val="Pendência 2"/>
                 <w:tag w:val="pendência_2"/>
-                <w:id w:val="1087"/>
+                <w:id w:val="1086"/>
                 <w:lock w:val="sdtLocked"/>
                 <w:showingPlcHdr/>
                 <w:text/>
@@ -7238,7 +7241,7 @@
                 </w:rPr>
                 <w:alias w:val="Responsável 2"/>
                 <w:tag w:val="responsável_2"/>
-                <w:id w:val="1088"/>
+                <w:id w:val="1087"/>
                 <w:lock w:val="sdtLocked"/>
                 <w:showingPlcHdr/>
                 <w:text/>
@@ -7274,7 +7277,7 @@
                 </w:rPr>
                 <w:alias w:val="Status pendência"/>
                 <w:tag w:val="status_pendência"/>
-                <w:id w:val="1089"/>
+                <w:id w:val="1088"/>
                 <w:lock w:val="sdtLocked"/>
                 <w:showingPlcHdr/>
                 <w:dropDownList>
@@ -7340,7 +7343,7 @@
                 </w:rPr>
                 <w:alias w:val="Pendência 3"/>
                 <w:tag w:val="pendência_3"/>
-                <w:id w:val="1090"/>
+                <w:id w:val="1089"/>
                 <w:lock w:val="sdtLocked"/>
                 <w:showingPlcHdr/>
                 <w:text/>
@@ -7375,7 +7378,7 @@
                 </w:rPr>
                 <w:alias w:val="Responsável 3"/>
                 <w:tag w:val="responsável_3"/>
-                <w:id w:val="1091"/>
+                <w:id w:val="1090"/>
                 <w:lock w:val="sdtLocked"/>
                 <w:showingPlcHdr/>
                 <w:text/>
@@ -7411,7 +7414,7 @@
                 </w:rPr>
                 <w:alias w:val="Status pendência"/>
                 <w:tag w:val="status_pendência"/>
-                <w:id w:val="1092"/>
+                <w:id w:val="1091"/>
                 <w:lock w:val="sdtLocked"/>
                 <w:showingPlcHdr/>
                 <w:dropDownList>
@@ -7630,7 +7633,7 @@
                 </w:rPr>
                 <w:alias w:val="Ensaio testemunhado"/>
                 <w:tag w:val="ensaio_testemunhado"/>
-                <w:id w:val="1093"/>
+                <w:id w:val="1092"/>
                 <w:lock w:val="sdtLocked"/>
                 <w:comboBox>
                   <w:listItem w:displayText="Fator de potência do isolamento e capacitância das buchas" w:value="Fator de potência do isolamento e capacitância das buchas"/>
@@ -7721,7 +7724,7 @@
                 </w:rPr>
                 <w:alias w:val="Evidência"/>
                 <w:tag w:val="evidência"/>
-                <w:id w:val="1094"/>
+                <w:id w:val="1093"/>
                 <w:lock w:val="sdtLocked"/>
                 <w:showingPlcHdr/>
                 <w:text/>
@@ -7757,7 +7760,7 @@
                 </w:rPr>
                 <w:alias w:val="Resultado"/>
                 <w:tag w:val="resultado"/>
-                <w:id w:val="1095"/>
+                <w:id w:val="1094"/>
                 <w:lock w:val="sdtLocked"/>
                 <w:showingPlcHdr/>
                 <w:dropDownList>
@@ -7809,7 +7812,7 @@
                 </w:rPr>
                 <w:alias w:val="Ensaio testemunhado"/>
                 <w:tag w:val="ensaio_testemunhado"/>
-                <w:id w:val="1096"/>
+                <w:id w:val="1095"/>
                 <w:lock w:val="sdtLocked"/>
                 <w:comboBox>
                   <w:listItem w:displayText="Fator de potência do isolamento e capacitância das buchas" w:value="Fator de potência do isolamento e capacitância das buchas"/>
@@ -7900,7 +7903,7 @@
                 </w:rPr>
                 <w:alias w:val="Evidência"/>
                 <w:tag w:val="evidência"/>
-                <w:id w:val="1097"/>
+                <w:id w:val="1096"/>
                 <w:lock w:val="sdtLocked"/>
                 <w:showingPlcHdr/>
                 <w:text/>
@@ -7936,7 +7939,7 @@
                 </w:rPr>
                 <w:alias w:val="Resultado"/>
                 <w:tag w:val="resultado"/>
-                <w:id w:val="1098"/>
+                <w:id w:val="1097"/>
                 <w:lock w:val="sdtLocked"/>
                 <w:showingPlcHdr/>
                 <w:dropDownList>
@@ -7988,7 +7991,7 @@
                 </w:rPr>
                 <w:alias w:val="Ensaio testemunhado"/>
                 <w:tag w:val="ensaio_testemunhado"/>
-                <w:id w:val="1099"/>
+                <w:id w:val="1098"/>
                 <w:lock w:val="sdtLocked"/>
                 <w:comboBox>
                   <w:listItem w:displayText="Fator de potência do isolamento e capacitância das buchas" w:value="Fator de potência do isolamento e capacitância das buchas"/>
@@ -8079,7 +8082,7 @@
                 </w:rPr>
                 <w:alias w:val="Evidência"/>
                 <w:tag w:val="evidência"/>
-                <w:id w:val="1100"/>
+                <w:id w:val="1099"/>
                 <w:lock w:val="sdtLocked"/>
                 <w:showingPlcHdr/>
                 <w:text/>
@@ -8115,7 +8118,7 @@
                 </w:rPr>
                 <w:alias w:val="Resultado"/>
                 <w:tag w:val="resultado"/>
-                <w:id w:val="1101"/>
+                <w:id w:val="1100"/>
                 <w:lock w:val="sdtLocked"/>
                 <w:showingPlcHdr/>
                 <w:dropDownList>
@@ -8167,7 +8170,7 @@
                 </w:rPr>
                 <w:alias w:val="Ensaio testemunhado"/>
                 <w:tag w:val="ensaio_testemunhado"/>
-                <w:id w:val="1102"/>
+                <w:id w:val="1101"/>
                 <w:lock w:val="sdtLocked"/>
                 <w:comboBox>
                   <w:listItem w:displayText="Fator de potência do isolamento e capacitância das buchas" w:value="Fator de potência do isolamento e capacitância das buchas"/>
@@ -8258,7 +8261,7 @@
                 </w:rPr>
                 <w:alias w:val="Evidência"/>
                 <w:tag w:val="evidência"/>
-                <w:id w:val="1103"/>
+                <w:id w:val="1102"/>
                 <w:lock w:val="sdtLocked"/>
                 <w:showingPlcHdr/>
                 <w:text/>
@@ -8294,7 +8297,7 @@
                 </w:rPr>
                 <w:alias w:val="Resultado"/>
                 <w:tag w:val="resultado"/>
-                <w:id w:val="1104"/>
+                <w:id w:val="1103"/>
                 <w:lock w:val="sdtLocked"/>
                 <w:showingPlcHdr/>
                 <w:dropDownList>
@@ -8346,7 +8349,7 @@
                 </w:rPr>
                 <w:alias w:val="Ensaio testemunhado"/>
                 <w:tag w:val="ensaio_testemunhado"/>
-                <w:id w:val="1105"/>
+                <w:id w:val="1104"/>
                 <w:lock w:val="sdtLocked"/>
                 <w:comboBox>
                   <w:listItem w:displayText="Fator de potência do isolamento e capacitância das buchas" w:value="Fator de potência do isolamento e capacitância das buchas"/>
@@ -8437,7 +8440,7 @@
                 </w:rPr>
                 <w:alias w:val="Evidência"/>
                 <w:tag w:val="evidência"/>
-                <w:id w:val="1106"/>
+                <w:id w:val="1105"/>
                 <w:lock w:val="sdtLocked"/>
                 <w:showingPlcHdr/>
                 <w:text/>
@@ -8473,7 +8476,7 @@
                 </w:rPr>
                 <w:alias w:val="Resultado"/>
                 <w:tag w:val="resultado"/>
-                <w:id w:val="1107"/>
+                <w:id w:val="1106"/>
                 <w:lock w:val="sdtLocked"/>
                 <w:showingPlcHdr/>
                 <w:dropDownList>
@@ -8525,7 +8528,7 @@
                 </w:rPr>
                 <w:alias w:val="Ensaio testemunhado"/>
                 <w:tag w:val="ensaio_testemunhado"/>
-                <w:id w:val="1108"/>
+                <w:id w:val="1107"/>
                 <w:lock w:val="sdtLocked"/>
                 <w:comboBox>
                   <w:listItem w:displayText="Fator de potência do isolamento e capacitância das buchas" w:value="Fator de potência do isolamento e capacitância das buchas"/>
@@ -8616,7 +8619,7 @@
                 </w:rPr>
                 <w:alias w:val="Evidência"/>
                 <w:tag w:val="evidência"/>
-                <w:id w:val="1109"/>
+                <w:id w:val="1108"/>
                 <w:lock w:val="sdtLocked"/>
                 <w:showingPlcHdr/>
                 <w:text/>
@@ -8652,7 +8655,7 @@
                 </w:rPr>
                 <w:alias w:val="Resultado"/>
                 <w:tag w:val="resultado"/>
-                <w:id w:val="1110"/>
+                <w:id w:val="1109"/>
                 <w:lock w:val="sdtLocked"/>
                 <w:showingPlcHdr/>
                 <w:dropDownList>
@@ -8704,7 +8707,7 @@
                 </w:rPr>
                 <w:alias w:val="Ensaio testemunhado"/>
                 <w:tag w:val="ensaio_testemunhado"/>
-                <w:id w:val="1111"/>
+                <w:id w:val="1110"/>
                 <w:lock w:val="sdtLocked"/>
                 <w:comboBox>
                   <w:listItem w:displayText="Fator de potência do isolamento e capacitância das buchas" w:value="Fator de potência do isolamento e capacitância das buchas"/>
@@ -8795,7 +8798,7 @@
                 </w:rPr>
                 <w:alias w:val="Evidência"/>
                 <w:tag w:val="evidência"/>
-                <w:id w:val="1112"/>
+                <w:id w:val="1111"/>
                 <w:lock w:val="sdtLocked"/>
                 <w:showingPlcHdr/>
                 <w:text/>
@@ -8831,7 +8834,7 @@
                 </w:rPr>
                 <w:alias w:val="Resultado"/>
                 <w:tag w:val="resultado"/>
-                <w:id w:val="1113"/>
+                <w:id w:val="1112"/>
                 <w:lock w:val="sdtLocked"/>
                 <w:showingPlcHdr/>
                 <w:dropDownList>
@@ -8883,7 +8886,7 @@
                 </w:rPr>
                 <w:alias w:val="Ensaio testemunhado"/>
                 <w:tag w:val="ensaio_testemunhado"/>
-                <w:id w:val="1114"/>
+                <w:id w:val="1113"/>
                 <w:lock w:val="sdtLocked"/>
                 <w:comboBox>
                   <w:listItem w:displayText="Fator de potência do isolamento e capacitância das buchas" w:value="Fator de potência do isolamento e capacitância das buchas"/>
@@ -8974,7 +8977,7 @@
                 </w:rPr>
                 <w:alias w:val="Evidência"/>
                 <w:tag w:val="evidência"/>
-                <w:id w:val="1115"/>
+                <w:id w:val="1114"/>
                 <w:lock w:val="sdtLocked"/>
                 <w:showingPlcHdr/>
                 <w:text/>
@@ -9010,7 +9013,7 @@
                 </w:rPr>
                 <w:alias w:val="Resultado"/>
                 <w:tag w:val="resultado"/>
-                <w:id w:val="1116"/>
+                <w:id w:val="1115"/>
                 <w:lock w:val="sdtLocked"/>
                 <w:showingPlcHdr/>
                 <w:dropDownList>
@@ -9062,7 +9065,7 @@
                 </w:rPr>
                 <w:alias w:val="Ensaio testemunhado"/>
                 <w:tag w:val="ensaio_testemunhado"/>
-                <w:id w:val="1117"/>
+                <w:id w:val="1116"/>
                 <w:lock w:val="sdtLocked"/>
                 <w:showingPlcHdr/>
                 <w:comboBox>
@@ -9155,7 +9158,7 @@
                 </w:rPr>
                 <w:alias w:val="Evidência"/>
                 <w:tag w:val="evidência"/>
-                <w:id w:val="1118"/>
+                <w:id w:val="1117"/>
                 <w:lock w:val="sdtLocked"/>
                 <w:showingPlcHdr/>
                 <w:text/>
@@ -9191,7 +9194,7 @@
                 </w:rPr>
                 <w:alias w:val="Resultado"/>
                 <w:tag w:val="resultado"/>
-                <w:id w:val="1119"/>
+                <w:id w:val="1118"/>
                 <w:lock w:val="sdtLocked"/>
                 <w:showingPlcHdr/>
                 <w:dropDownList>
@@ -9243,7 +9246,7 @@
                 </w:rPr>
                 <w:alias w:val="Ensaio testemunhado"/>
                 <w:tag w:val="ensaio_testemunhado"/>
-                <w:id w:val="1120"/>
+                <w:id w:val="1119"/>
                 <w:lock w:val="sdtLocked"/>
                 <w:showingPlcHdr/>
                 <w:comboBox>
@@ -9336,7 +9339,7 @@
                 </w:rPr>
                 <w:alias w:val="Evidência"/>
                 <w:tag w:val="evidência"/>
-                <w:id w:val="1121"/>
+                <w:id w:val="1120"/>
                 <w:lock w:val="sdtLocked"/>
                 <w:showingPlcHdr/>
                 <w:text/>
@@ -9372,7 +9375,7 @@
                 </w:rPr>
                 <w:alias w:val="Resultado"/>
                 <w:tag w:val="resultado"/>
-                <w:id w:val="1122"/>
+                <w:id w:val="1121"/>
                 <w:lock w:val="sdtLocked"/>
                 <w:showingPlcHdr/>
                 <w:dropDownList>
@@ -9542,7 +9545,7 @@
                 </w:rPr>
                 <w:alias w:val="Data dos ensaios"/>
                 <w:tag w:val="data_dos_ensaios"/>
-                <w:id w:val="1123"/>
+                <w:id w:val="1122"/>
                 <w:lock w:val="sdtLocked"/>
                 <w:showingPlcHdr/>
                 <w:date>
@@ -9581,7 +9584,7 @@
                 </w:rPr>
                 <w:alias w:val="Resultado do parecer"/>
                 <w:tag w:val="resultado_do_parecer"/>
-                <w:id w:val="1124"/>
+                <w:id w:val="1123"/>
                 <w:lock w:val="sdtLocked"/>
                 <w:showingPlcHdr/>
                 <w:dropDownList>
@@ -9619,7 +9622,7 @@
                 </w:rPr>
                 <w:alias w:val="Observações do parecer"/>
                 <w:tag w:val="observações_do_parecer"/>
-                <w:id w:val="1125"/>
+                <w:id w:val="1124"/>
                 <w:lock w:val="sdtLocked"/>
                 <w:showingPlcHdr/>
                 <w:text/>
@@ -9767,7 +9770,7 @@
               <w:sdtPr>
                 <w:alias w:val="Foto"/>
                 <w:tag w:val="foto"/>
-                <w:id w:val="1126"/>
+                <w:id w:val="1125"/>
                 <w:lock w:val="sdtLocked"/>
                 <w:showingPlcHdr/>
                 <w:picture/>
@@ -9789,7 +9792,7 @@
                               <pic:cNvPicPr/>
                             </pic:nvPicPr>
                             <pic:blipFill>
-                              <a:blip r:embed="rId12"/>
+                              <a:blip r:embed="rId11"/>
                               <a:stretch>
                                 <a:fillRect/>
                               </a:stretch>
@@ -9824,7 +9827,7 @@
               <w:sdtPr>
                 <w:alias w:val="Foto"/>
                 <w:tag w:val="foto"/>
-                <w:id w:val="1128"/>
+                <w:id w:val="1127"/>
                 <w:lock w:val="sdtLocked"/>
                 <w:showingPlcHdr/>
                 <w:picture/>
@@ -9846,7 +9849,7 @@
                               <pic:cNvPicPr/>
                             </pic:nvPicPr>
                             <pic:blipFill>
-                              <a:blip r:embed="rId12"/>
+                              <a:blip r:embed="rId11"/>
                               <a:stretch>
                                 <a:fillRect/>
                               </a:stretch>
@@ -9896,7 +9899,7 @@
                 </w:rPr>
                 <w:alias w:val="Legenda foto 1"/>
                 <w:tag w:val="legenda_foto_1"/>
-                <w:id w:val="1127"/>
+                <w:id w:val="1126"/>
                 <w:lock w:val="sdtLocked"/>
                 <w:showingPlcHdr/>
                 <w:text/>
@@ -9940,7 +9943,7 @@
                 </w:rPr>
                 <w:alias w:val="Legenda foto 2"/>
                 <w:tag w:val="legenda_foto_2"/>
-                <w:id w:val="1129"/>
+                <w:id w:val="1128"/>
                 <w:lock w:val="sdtLocked"/>
                 <w:showingPlcHdr/>
                 <w:text/>
@@ -9976,7 +9979,7 @@
               <w:sdtPr>
                 <w:alias w:val="Foto"/>
                 <w:tag w:val="foto"/>
-                <w:id w:val="1130"/>
+                <w:id w:val="1129"/>
                 <w:lock w:val="sdtLocked"/>
                 <w:showingPlcHdr/>
                 <w:picture/>
@@ -9998,7 +10001,7 @@
                               <pic:cNvPicPr/>
                             </pic:nvPicPr>
                             <pic:blipFill>
-                              <a:blip r:embed="rId12"/>
+                              <a:blip r:embed="rId11"/>
                               <a:stretch>
                                 <a:fillRect/>
                               </a:stretch>
@@ -10033,7 +10036,7 @@
               <w:sdtPr>
                 <w:alias w:val="Foto"/>
                 <w:tag w:val="foto"/>
-                <w:id w:val="1132"/>
+                <w:id w:val="1131"/>
                 <w:lock w:val="sdtLocked"/>
                 <w:showingPlcHdr/>
                 <w:picture/>
@@ -10055,7 +10058,7 @@
                               <pic:cNvPicPr/>
                             </pic:nvPicPr>
                             <pic:blipFill>
-                              <a:blip r:embed="rId12"/>
+                              <a:blip r:embed="rId11"/>
                               <a:stretch>
                                 <a:fillRect/>
                               </a:stretch>
@@ -10105,7 +10108,7 @@
                 </w:rPr>
                 <w:alias w:val="Legenda foto 3"/>
                 <w:tag w:val="legenda_foto_3"/>
-                <w:id w:val="1131"/>
+                <w:id w:val="1130"/>
                 <w:lock w:val="sdtLocked"/>
                 <w:showingPlcHdr/>
                 <w:text/>
@@ -10149,7 +10152,7 @@
                 </w:rPr>
                 <w:alias w:val="Legenda foto 4"/>
                 <w:tag w:val="legenda_foto_4"/>
-                <w:id w:val="1133"/>
+                <w:id w:val="1132"/>
                 <w:lock w:val="sdtLocked"/>
                 <w:showingPlcHdr/>
                 <w:text/>
@@ -10185,7 +10188,7 @@
               <w:sdtPr>
                 <w:alias w:val="Foto"/>
                 <w:tag w:val="foto"/>
-                <w:id w:val="1134"/>
+                <w:id w:val="1133"/>
                 <w:lock w:val="sdtLocked"/>
                 <w:showingPlcHdr/>
                 <w:picture/>
@@ -10207,7 +10210,7 @@
                               <pic:cNvPicPr/>
                             </pic:nvPicPr>
                             <pic:blipFill>
-                              <a:blip r:embed="rId12"/>
+                              <a:blip r:embed="rId11"/>
                               <a:stretch>
                                 <a:fillRect/>
                               </a:stretch>
@@ -10242,7 +10245,7 @@
               <w:sdtPr>
                 <w:alias w:val="Foto"/>
                 <w:tag w:val="foto"/>
-                <w:id w:val="1136"/>
+                <w:id w:val="1135"/>
                 <w:lock w:val="sdtLocked"/>
                 <w:showingPlcHdr/>
                 <w:picture/>
@@ -10264,7 +10267,7 @@
                               <pic:cNvPicPr/>
                             </pic:nvPicPr>
                             <pic:blipFill>
-                              <a:blip r:embed="rId12"/>
+                              <a:blip r:embed="rId11"/>
                               <a:stretch>
                                 <a:fillRect/>
                               </a:stretch>
@@ -10314,7 +10317,7 @@
                 </w:rPr>
                 <w:alias w:val="Legenda foto 5"/>
                 <w:tag w:val="legenda_foto_5"/>
-                <w:id w:val="1135"/>
+                <w:id w:val="1134"/>
                 <w:lock w:val="sdtLocked"/>
                 <w:showingPlcHdr/>
                 <w:text/>
@@ -10358,7 +10361,7 @@
                 </w:rPr>
                 <w:alias w:val="Legenda foto 6"/>
                 <w:tag w:val="legenda_foto_6"/>
-                <w:id w:val="1137"/>
+                <w:id w:val="1136"/>
                 <w:lock w:val="sdtLocked"/>
                 <w:showingPlcHdr/>
                 <w:text/>
@@ -10647,7 +10650,7 @@
                 </w:rPr>
                 <w:alias w:val="Data rev. 00"/>
                 <w:tag w:val="data_rev._00"/>
-                <w:id w:val="1138"/>
+                <w:id w:val="1137"/>
                 <w:lock w:val="sdtLocked"/>
                 <w:showingPlcHdr/>
                 <w:date>
@@ -10707,7 +10710,7 @@
                 </w:rPr>
                 <w:alias w:val="Elaborado rev. 00"/>
                 <w:tag w:val="elaborado_rev._00"/>
-                <w:id w:val="1139"/>
+                <w:id w:val="1138"/>
                 <w:lock w:val="sdtLocked"/>
                 <w:showingPlcHdr/>
                 <w:text/>
@@ -10742,7 +10745,7 @@
                 </w:rPr>
                 <w:alias w:val="Aprovado rev. 00"/>
                 <w:tag w:val="aprovado_rev._00"/>
-                <w:id w:val="1140"/>
+                <w:id w:val="1139"/>
                 <w:lock w:val="sdtLocked"/>
                 <w:showingPlcHdr/>
                 <w:text/>
@@ -10782,7 +10785,7 @@
                 </w:rPr>
                 <w:alias w:val="Rev."/>
                 <w:tag w:val="rev."/>
-                <w:id w:val="1141"/>
+                <w:id w:val="1140"/>
                 <w:lock w:val="sdtLocked"/>
                 <w:showingPlcHdr/>
                 <w:text/>
@@ -10817,7 +10820,7 @@
                 </w:rPr>
                 <w:alias w:val="Data rev."/>
                 <w:tag w:val="data_rev."/>
-                <w:id w:val="1142"/>
+                <w:id w:val="1141"/>
                 <w:lock w:val="sdtLocked"/>
                 <w:showingPlcHdr/>
                 <w:date>
@@ -10857,7 +10860,7 @@
                 </w:rPr>
                 <w:alias w:val="Descrição rev."/>
                 <w:tag w:val="descrição_rev."/>
-                <w:id w:val="1143"/>
+                <w:id w:val="1142"/>
                 <w:lock w:val="sdtLocked"/>
                 <w:showingPlcHdr/>
                 <w:text/>
@@ -10892,7 +10895,7 @@
                 </w:rPr>
                 <w:alias w:val="Elaborado rev."/>
                 <w:tag w:val="elaborado_rev."/>
-                <w:id w:val="1144"/>
+                <w:id w:val="1143"/>
                 <w:lock w:val="sdtLocked"/>
                 <w:showingPlcHdr/>
                 <w:text/>
@@ -10927,7 +10930,7 @@
                 </w:rPr>
                 <w:alias w:val="Aprovado rev."/>
                 <w:tag w:val="aprovado_rev."/>
-                <w:id w:val="1145"/>
+                <w:id w:val="1144"/>
                 <w:lock w:val="sdtLocked"/>
                 <w:showingPlcHdr/>
                 <w:text/>
@@ -10948,8 +10951,8 @@
       </w:tr>
     </w:tbl>
     <w:sectPr>
-      <w:headerReference w:type="default" r:id="rId10"/>
-      <w:footerReference w:type="default" r:id="rId11"/>
+      <w:headerReference w:type="default" r:id="rId9"/>
+      <w:footerReference w:type="default" r:id="rId10"/>
       <w:pgSz w:w="11906" w:h="16838"/>
       <w:pgMar w:top="680" w:right="1134" w:bottom="850" w:left="1134" w:header="454" w:footer="340" w:gutter="0"/>
       <w:cols w:space="720"/>
@@ -11098,31 +11101,46 @@
           <w:pPr>
             <w:jc w:val="right"/>
           </w:pPr>
-          <w:sdt>
-            <w:sdtPr>
-              <w:rPr>
-                <w:color w:val="5F6064"/>
-                <w:sz w:val="13"/>
-              </w:rPr>
-              <w:alias w:val="Nº do relatório (rodapé)"/>
-              <w:tag w:val="nº_do_relatório_(rodapé)"/>
-              <w:id w:val="1004"/>
-              <w:lock w:val="sdtContentLocked"/>
-              <w:showingPlcHdr/>
-              <w:dataBinding w:prefixMappings="xmlns:ns0='urn:sgs:rcf'" w:xpath="/ns0:rcf[1]/ns0:numero[1]" w:storeItemID="{6C3C8BC8-F283-45AE-878A-BAB7291924A1}"/>
-              <w:text/>
-            </w:sdtPr>
-            <w:sdtContent>
-              <w:r>
-                <w:rPr>
-                  <w:i/>
-                  <w:color w:val="8A8B8E"/>
-                  <w:sz w:val="13"/>
-                </w:rPr>
-                <w:t xml:space="preserve">RCF-[SIGLA]-[0000]-[AAAA]</w:t>
-              </w:r>
-            </w:sdtContent>
-          </w:sdt>
+          <w:r>
+            <w:rPr>
+              <w:b w:val="0"/>
+              <w:color w:val="5F6064"/>
+              <w:sz w:val="13"/>
+            </w:rPr>
+            <w:fldChar w:fldCharType="begin"/>
+          </w:r>
+          <w:r>
+            <w:rPr>
+              <w:b w:val="0"/>
+              <w:color w:val="5F6064"/>
+              <w:sz w:val="13"/>
+            </w:rPr>
+            <w:instrText xml:space="preserve"> REF RCF_NUMERO \* MERGEFORMAT </w:instrText>
+          </w:r>
+          <w:r>
+            <w:rPr>
+              <w:b w:val="0"/>
+              <w:color w:val="5F6064"/>
+              <w:sz w:val="13"/>
+            </w:rPr>
+            <w:fldChar w:fldCharType="separate"/>
+          </w:r>
+          <w:r>
+            <w:rPr>
+              <w:b w:val="0"/>
+              <w:color w:val="5F6064"/>
+              <w:sz w:val="13"/>
+            </w:rPr>
+            <w:t>RCF-[SIGLA]-[0000]-[AAAA]</w:t>
+          </w:r>
+          <w:r>
+            <w:rPr>
+              <w:b w:val="0"/>
+              <w:color w:val="5F6064"/>
+              <w:sz w:val="13"/>
+            </w:rPr>
+            <w:fldChar w:fldCharType="end"/>
+          </w:r>
         </w:p>
         <w:p>
           <w:pPr>
@@ -11458,33 +11476,46 @@
             </w:rPr>
             <w:t xml:space="preserve">Nº </w:t>
           </w:r>
-          <w:sdt>
-            <w:sdtPr>
-              <w:rPr>
-                <w:b/>
-                <w:color w:val="2B2C2E"/>
-                <w:sz w:val="16"/>
-              </w:rPr>
-              <w:alias w:val="Nº do relatório (cabeçalho)"/>
-              <w:tag w:val="nº_do_relatório_(cabeçalho)"/>
-              <w:id w:val="1001"/>
-              <w:lock w:val="sdtContentLocked"/>
-              <w:showingPlcHdr/>
-              <w:dataBinding w:prefixMappings="xmlns:ns0='urn:sgs:rcf'" w:xpath="/ns0:rcf[1]/ns0:numero[1]" w:storeItemID="{6C3C8BC8-F283-45AE-878A-BAB7291924A1}"/>
-              <w:text/>
-            </w:sdtPr>
-            <w:sdtContent>
-              <w:r>
-                <w:rPr>
-                  <w:b/>
-                  <w:i/>
-                  <w:color w:val="8A8B8E"/>
-                  <w:sz w:val="16"/>
-                </w:rPr>
-                <w:t xml:space="preserve">RCF-[SIGLA]-[0000]-[AAAA]</w:t>
-              </w:r>
-            </w:sdtContent>
-          </w:sdt>
+          <w:r>
+            <w:rPr>
+              <w:b/>
+              <w:color w:val="2B2C2E"/>
+              <w:sz w:val="16"/>
+            </w:rPr>
+            <w:fldChar w:fldCharType="begin"/>
+          </w:r>
+          <w:r>
+            <w:rPr>
+              <w:b/>
+              <w:color w:val="2B2C2E"/>
+              <w:sz w:val="16"/>
+            </w:rPr>
+            <w:instrText xml:space="preserve"> REF RCF_NUMERO \* MERGEFORMAT </w:instrText>
+          </w:r>
+          <w:r>
+            <w:rPr>
+              <w:b/>
+              <w:color w:val="2B2C2E"/>
+              <w:sz w:val="16"/>
+            </w:rPr>
+            <w:fldChar w:fldCharType="separate"/>
+          </w:r>
+          <w:r>
+            <w:rPr>
+              <w:b/>
+              <w:color w:val="2B2C2E"/>
+              <w:sz w:val="16"/>
+            </w:rPr>
+            <w:t>RCF-[SIGLA]-[0000]-[AAAA]</w:t>
+          </w:r>
+          <w:r>
+            <w:rPr>
+              <w:b/>
+              <w:color w:val="2B2C2E"/>
+              <w:sz w:val="16"/>
+            </w:rPr>
+            <w:fldChar w:fldCharType="end"/>
+          </w:r>
         </w:p>
         <w:p>
           <w:pPr>
@@ -11499,31 +11530,46 @@
             </w:rPr>
             <w:t xml:space="preserve">Rev. </w:t>
           </w:r>
-          <w:sdt>
-            <w:sdtPr>
-              <w:rPr>
-                <w:color w:val="2B2C2E"/>
-                <w:sz w:val="15"/>
-              </w:rPr>
-              <w:alias w:val="Revisão (cabeçalho)"/>
-              <w:tag w:val="revisão_(cabeçalho)"/>
-              <w:id w:val="1002"/>
-              <w:lock w:val="sdtContentLocked"/>
-              <w:showingPlcHdr/>
-              <w:dataBinding w:prefixMappings="xmlns:ns0='urn:sgs:rcf'" w:xpath="/ns0:rcf[1]/ns0:revisao[1]" w:storeItemID="{6C3C8BC8-F283-45AE-878A-BAB7291924A1}"/>
-              <w:text/>
-            </w:sdtPr>
-            <w:sdtContent>
-              <w:r>
-                <w:rPr>
-                  <w:i/>
-                  <w:color w:val="8A8B8E"/>
-                  <w:sz w:val="15"/>
-                </w:rPr>
-                <w:t xml:space="preserve">00</w:t>
-              </w:r>
-            </w:sdtContent>
-          </w:sdt>
+          <w:r>
+            <w:rPr>
+              <w:b w:val="0"/>
+              <w:color w:val="2B2C2E"/>
+              <w:sz w:val="15"/>
+            </w:rPr>
+            <w:fldChar w:fldCharType="begin"/>
+          </w:r>
+          <w:r>
+            <w:rPr>
+              <w:b w:val="0"/>
+              <w:color w:val="2B2C2E"/>
+              <w:sz w:val="15"/>
+            </w:rPr>
+            <w:instrText xml:space="preserve"> REF RCF_REVISAO \* MERGEFORMAT </w:instrText>
+          </w:r>
+          <w:r>
+            <w:rPr>
+              <w:b w:val="0"/>
+              <w:color w:val="2B2C2E"/>
+              <w:sz w:val="15"/>
+            </w:rPr>
+            <w:fldChar w:fldCharType="separate"/>
+          </w:r>
+          <w:r>
+            <w:rPr>
+              <w:b w:val="0"/>
+              <w:color w:val="2B2C2E"/>
+              <w:sz w:val="15"/>
+            </w:rPr>
+            <w:t>00</w:t>
+          </w:r>
+          <w:r>
+            <w:rPr>
+              <w:b w:val="0"/>
+              <w:color w:val="2B2C2E"/>
+              <w:sz w:val="15"/>
+            </w:rPr>
+            <w:fldChar w:fldCharType="end"/>
+          </w:r>
           <w:r>
             <w:rPr>
               <w:b w:val="0"/>
@@ -11533,36 +11579,46 @@
             </w:rPr>
             <w:t xml:space="preserve">  ·  Emissão </w:t>
           </w:r>
-          <w:sdt>
-            <w:sdtPr>
-              <w:rPr>
-                <w:color w:val="2B2C2E"/>
-                <w:sz w:val="15"/>
-              </w:rPr>
-              <w:alias w:val="Emissão (cabeçalho)"/>
-              <w:tag w:val="emissão_(cabeçalho)"/>
-              <w:id w:val="1003"/>
-              <w:lock w:val="sdtContentLocked"/>
-              <w:showingPlcHdr/>
-              <w:dataBinding w:prefixMappings="xmlns:ns0='urn:sgs:rcf'" w:xpath="/ns0:rcf[1]/ns0:emissao[1]" w:storeItemID="{6C3C8BC8-F283-45AE-878A-BAB7291924A1}"/>
-              <w:date>
-                <w:dateFormat w:val="dd/MM/yyyy"/>
-                <w:lid w:val="pt-BR"/>
-                <w:storeMappedDataAs w:val="text"/>
-                <w:calendar w:val="gregorian"/>
-              </w:date>
-            </w:sdtPr>
-            <w:sdtContent>
-              <w:r>
-                <w:rPr>
-                  <w:i/>
-                  <w:color w:val="8A8B8E"/>
-                  <w:sz w:val="15"/>
-                </w:rPr>
-                <w:t xml:space="preserve">DD/MM/AAAA</w:t>
-              </w:r>
-            </w:sdtContent>
-          </w:sdt>
+          <w:r>
+            <w:rPr>
+              <w:b w:val="0"/>
+              <w:color w:val="2B2C2E"/>
+              <w:sz w:val="15"/>
+            </w:rPr>
+            <w:fldChar w:fldCharType="begin"/>
+          </w:r>
+          <w:r>
+            <w:rPr>
+              <w:b w:val="0"/>
+              <w:color w:val="2B2C2E"/>
+              <w:sz w:val="15"/>
+            </w:rPr>
+            <w:instrText xml:space="preserve"> REF RCF_EMISSAO \* MERGEFORMAT </w:instrText>
+          </w:r>
+          <w:r>
+            <w:rPr>
+              <w:b w:val="0"/>
+              <w:color w:val="2B2C2E"/>
+              <w:sz w:val="15"/>
+            </w:rPr>
+            <w:fldChar w:fldCharType="separate"/>
+          </w:r>
+          <w:r>
+            <w:rPr>
+              <w:b w:val="0"/>
+              <w:color w:val="2B2C2E"/>
+              <w:sz w:val="15"/>
+            </w:rPr>
+            <w:t>DD/MM/AAAA</w:t>
+          </w:r>
+          <w:r>
+            <w:rPr>
+              <w:b w:val="0"/>
+              <w:color w:val="2B2C2E"/>
+              <w:sz w:val="15"/>
+            </w:rPr>
+            <w:fldChar w:fldCharType="end"/>
+          </w:r>
         </w:p>
         <w:p>
           <w:pPr>
@@ -35856,26 +35912,10 @@
 <b:Sources xmlns:b="http://schemas.openxmlformats.org/officeDocument/2006/bibliography" xmlns="http://schemas.openxmlformats.org/officeDocument/2006/bibliography" SelectedStyle="/APA.XSL" StyleName="APA"/>
 </file>
 
-<file path=customXml/item2.xml><?xml version="1.0" encoding="utf-8"?>
-<rcf xmlns="urn:sgs:rcf">
-  <numero/>
-  <revisao/>
-  <emissao/>
-</rcf>
-</file>
-
 <file path=customXml/itemProps1.xml><?xml version="1.0" encoding="utf-8"?>
 <ds:datastoreItem xmlns:ds="http://schemas.openxmlformats.org/officeDocument/2006/customXml" ds:itemID="{EF278816-EC6F-A645-907D-7F25AECB1D4A}">
   <ds:schemaRefs>
     <ds:schemaRef ds:uri="http://schemas.openxmlformats.org/officeDocument/2006/bibliography"/>
   </ds:schemaRefs>
 </ds:datastoreItem>
-</file>
-
-<file path=customXml/itemProps2.xml><?xml version="1.0" encoding="utf-8"?>
-<ds:datastoreItem xmlns:ds="http://schemas.openxmlformats.org/officeDocument/2006/customXml" ds:itemID="{6C3C8BC8-F283-45AE-878A-BAB7291924A1}">
-  <ds:schemaRefs>
-    <ds:schemaRef ds:uri="urn:sgs:rcf"/>
-  </ds:schemaRefs>
-</ds:datastoreItem>
 </file>
</xml_diff>

<commit_message>
RCF padrão SGS: remove nº, revisão e emissão do cabeçalho e rodapé
Esses dados ficam só no quadro de identificação; o cabeçalho fica fixo
(logos e título) e a paginação permanece no rodapé.

Co-Authored-By: Claude Opus 5.5 <noreply@anthropic.com>
Claude-Session: https://claude.ai/code/session_012WTuzpchRfoPVn4CU6YUC5
</commit_message>
<xml_diff>
--- a/modelos/RCF_Padrao_SGS_AXIA_modelo.docx
+++ b/modelos/RCF_Padrao_SGS_AXIA_modelo.docx
@@ -79,7 +79,6 @@
             <w:pPr>
               <w:spacing w:after="20"/>
             </w:pPr>
-            <w:bookmarkStart w:id="1002" w:name="RCF_NUMERO"/>
             <w:sdt>
               <w:sdtPr>
                 <w:rPr>
@@ -106,7 +105,6 @@
                 </w:r>
               </w:sdtContent>
             </w:sdt>
-            <w:bookmarkEnd w:id="1002"/>
           </w:p>
         </w:tc>
         <w:tc>
@@ -132,7 +130,6 @@
             <w:pPr>
               <w:spacing w:after="20"/>
             </w:pPr>
-            <w:bookmarkStart w:id="1004" w:name="RCF_REVISAO"/>
             <w:sdt>
               <w:sdtPr>
                 <w:rPr>
@@ -142,7 +139,7 @@
                 </w:rPr>
                 <w:alias w:val="Revisão"/>
                 <w:tag w:val="revisão"/>
-                <w:id w:val="1003"/>
+                <w:id w:val="1002"/>
                 <w:lock w:val="sdtLocked"/>
                 <w:showingPlcHdr/>
                 <w:text/>
@@ -159,7 +156,6 @@
                 </w:r>
               </w:sdtContent>
             </w:sdt>
-            <w:bookmarkEnd w:id="1004"/>
           </w:p>
         </w:tc>
         <w:tc>
@@ -185,7 +181,6 @@
             <w:pPr>
               <w:spacing w:after="20"/>
             </w:pPr>
-            <w:bookmarkStart w:id="1006" w:name="RCF_EMISSAO"/>
             <w:sdt>
               <w:sdtPr>
                 <w:rPr>
@@ -195,7 +190,7 @@
                 </w:rPr>
                 <w:alias w:val="Data de emissão"/>
                 <w:tag w:val="data_de_emissão"/>
-                <w:id w:val="1005"/>
+                <w:id w:val="1003"/>
                 <w:lock w:val="sdtLocked"/>
                 <w:showingPlcHdr/>
                 <w:date>
@@ -217,7 +212,6 @@
                 </w:r>
               </w:sdtContent>
             </w:sdt>
-            <w:bookmarkEnd w:id="1006"/>
           </w:p>
         </w:tc>
       </w:tr>
@@ -252,7 +246,7 @@
                 </w:rPr>
                 <w:alias w:val="Documento de aquisição"/>
                 <w:tag w:val="documento_de_aquisição"/>
-                <w:id w:val="1007"/>
+                <w:id w:val="1004"/>
                 <w:lock w:val="sdtLocked"/>
                 <w:showingPlcHdr/>
                 <w:text/>
@@ -300,7 +294,7 @@
                 </w:rPr>
                 <w:alias w:val="Item / lista de material"/>
                 <w:tag w:val="item_/_lista_de_material"/>
-                <w:id w:val="1008"/>
+                <w:id w:val="1005"/>
                 <w:lock w:val="sdtLocked"/>
                 <w:showingPlcHdr/>
                 <w:text/>
@@ -348,7 +342,7 @@
                 </w:rPr>
                 <w:alias w:val="PICQ nº"/>
                 <w:tag w:val="picq_nº"/>
-                <w:id w:val="1009"/>
+                <w:id w:val="1006"/>
                 <w:lock w:val="sdtLocked"/>
                 <w:showingPlcHdr/>
                 <w:text/>
@@ -398,7 +392,7 @@
                 </w:rPr>
                 <w:alias w:val="Empreendimento"/>
                 <w:tag w:val="empreendimento"/>
-                <w:id w:val="1010"/>
+                <w:id w:val="1007"/>
                 <w:lock w:val="sdtLocked"/>
                 <w:showingPlcHdr/>
                 <w:text/>
@@ -446,7 +440,7 @@
                 </w:rPr>
                 <w:alias w:val="Fornecedor / subfornecedor"/>
                 <w:tag w:val="fornecedor_/_subfornecedor"/>
-                <w:id w:val="1011"/>
+                <w:id w:val="1008"/>
                 <w:lock w:val="sdtLocked"/>
                 <w:showingPlcHdr/>
                 <w:text/>
@@ -494,7 +488,7 @@
                 </w:rPr>
                 <w:alias w:val="Data da inspeção"/>
                 <w:tag w:val="data_da_inspeção"/>
-                <w:id w:val="1012"/>
+                <w:id w:val="1009"/>
                 <w:lock w:val="sdtLocked"/>
                 <w:showingPlcHdr/>
                 <w:date>
@@ -550,7 +544,7 @@
                 </w:rPr>
                 <w:alias w:val="Material"/>
                 <w:tag w:val="material"/>
-                <w:id w:val="1013"/>
+                <w:id w:val="1010"/>
                 <w:lock w:val="sdtLocked"/>
                 <w:showingPlcHdr/>
                 <w:text/>
@@ -598,7 +592,7 @@
                 </w:rPr>
                 <w:alias w:val="Nº de série"/>
                 <w:tag w:val="nº_de_série"/>
-                <w:id w:val="1014"/>
+                <w:id w:val="1011"/>
                 <w:lock w:val="sdtLocked"/>
                 <w:showingPlcHdr/>
                 <w:text/>
@@ -687,7 +681,7 @@
                 </w:rPr>
                 <w:alias w:val="Situação geral"/>
                 <w:tag w:val="situação_geral"/>
-                <w:id w:val="1015"/>
+                <w:id w:val="1012"/>
                 <w:lock w:val="sdtLocked"/>
                 <w:showingPlcHdr/>
                 <w:dropDownList>
@@ -904,7 +898,7 @@
                 </w:rPr>
                 <w:alias w:val="Situação 1.1"/>
                 <w:tag w:val="situação_1.1"/>
-                <w:id w:val="1016"/>
+                <w:id w:val="1013"/>
                 <w:lock w:val="sdtLocked"/>
                 <w:showingPlcHdr/>
                 <w:dropDownList>
@@ -999,7 +993,7 @@
                 </w:rPr>
                 <w:alias w:val="Situação 1.2"/>
                 <w:tag w:val="situação_1.2"/>
-                <w:id w:val="1017"/>
+                <w:id w:val="1014"/>
                 <w:lock w:val="sdtLocked"/>
                 <w:showingPlcHdr/>
                 <w:dropDownList>
@@ -1094,7 +1088,7 @@
                 </w:rPr>
                 <w:alias w:val="Situação 1.3"/>
                 <w:tag w:val="situação_1.3"/>
-                <w:id w:val="1018"/>
+                <w:id w:val="1015"/>
                 <w:lock w:val="sdtLocked"/>
                 <w:showingPlcHdr/>
                 <w:dropDownList>
@@ -1189,7 +1183,7 @@
                 </w:rPr>
                 <w:alias w:val="Situação 1.4"/>
                 <w:tag w:val="situação_1.4"/>
-                <w:id w:val="1019"/>
+                <w:id w:val="1016"/>
                 <w:lock w:val="sdtLocked"/>
                 <w:showingPlcHdr/>
                 <w:dropDownList>
@@ -1284,7 +1278,7 @@
                 </w:rPr>
                 <w:alias w:val="Situação 1.5"/>
                 <w:tag w:val="situação_1.5"/>
-                <w:id w:val="1020"/>
+                <w:id w:val="1017"/>
                 <w:lock w:val="sdtLocked"/>
                 <w:showingPlcHdr/>
                 <w:dropDownList>
@@ -1379,7 +1373,7 @@
                 </w:rPr>
                 <w:alias w:val="Situação 1.6"/>
                 <w:tag w:val="situação_1.6"/>
-                <w:id w:val="1021"/>
+                <w:id w:val="1018"/>
                 <w:lock w:val="sdtLocked"/>
                 <w:showingPlcHdr/>
                 <w:dropDownList>
@@ -1474,7 +1468,7 @@
                 </w:rPr>
                 <w:alias w:val="Situação 1.7"/>
                 <w:tag w:val="situação_1.7"/>
-                <w:id w:val="1022"/>
+                <w:id w:val="1019"/>
                 <w:lock w:val="sdtLocked"/>
                 <w:showingPlcHdr/>
                 <w:dropDownList>
@@ -1569,7 +1563,7 @@
                 </w:rPr>
                 <w:alias w:val="Situação 1.8"/>
                 <w:tag w:val="situação_1.8"/>
-                <w:id w:val="1023"/>
+                <w:id w:val="1020"/>
                 <w:lock w:val="sdtLocked"/>
                 <w:showingPlcHdr/>
                 <w:dropDownList>
@@ -1664,7 +1658,7 @@
                 </w:rPr>
                 <w:alias w:val="Situação 1.9"/>
                 <w:tag w:val="situação_1.9"/>
-                <w:id w:val="1024"/>
+                <w:id w:val="1021"/>
                 <w:lock w:val="sdtLocked"/>
                 <w:showingPlcHdr/>
                 <w:dropDownList>
@@ -1759,7 +1753,7 @@
                 </w:rPr>
                 <w:alias w:val="Situação 1.10"/>
                 <w:tag w:val="situação_1.10"/>
-                <w:id w:val="1025"/>
+                <w:id w:val="1022"/>
                 <w:lock w:val="sdtLocked"/>
                 <w:showingPlcHdr/>
                 <w:dropDownList>
@@ -1854,7 +1848,7 @@
                 </w:rPr>
                 <w:alias w:val="Situação 1.11"/>
                 <w:tag w:val="situação_1.11"/>
-                <w:id w:val="1026"/>
+                <w:id w:val="1023"/>
                 <w:lock w:val="sdtLocked"/>
                 <w:showingPlcHdr/>
                 <w:dropDownList>
@@ -1949,7 +1943,7 @@
                 </w:rPr>
                 <w:alias w:val="Situação 1.12"/>
                 <w:tag w:val="situação_1.12"/>
-                <w:id w:val="1027"/>
+                <w:id w:val="1024"/>
                 <w:lock w:val="sdtLocked"/>
                 <w:showingPlcHdr/>
                 <w:dropDownList>
@@ -2044,7 +2038,7 @@
                 </w:rPr>
                 <w:alias w:val="Situação 1.13"/>
                 <w:tag w:val="situação_1.13"/>
-                <w:id w:val="1028"/>
+                <w:id w:val="1025"/>
                 <w:lock w:val="sdtLocked"/>
                 <w:showingPlcHdr/>
                 <w:dropDownList>
@@ -2139,7 +2133,7 @@
                 </w:rPr>
                 <w:alias w:val="Situação 1.14"/>
                 <w:tag w:val="situação_1.14"/>
-                <w:id w:val="1029"/>
+                <w:id w:val="1026"/>
                 <w:lock w:val="sdtLocked"/>
                 <w:showingPlcHdr/>
                 <w:dropDownList>
@@ -2234,7 +2228,7 @@
                 </w:rPr>
                 <w:alias w:val="Situação 1.15"/>
                 <w:tag w:val="situação_1.15"/>
-                <w:id w:val="1030"/>
+                <w:id w:val="1027"/>
                 <w:lock w:val="sdtLocked"/>
                 <w:showingPlcHdr/>
                 <w:dropDownList>
@@ -2329,7 +2323,7 @@
                 </w:rPr>
                 <w:alias w:val="Situação 1.16"/>
                 <w:tag w:val="situação_1.16"/>
-                <w:id w:val="1031"/>
+                <w:id w:val="1028"/>
                 <w:lock w:val="sdtLocked"/>
                 <w:showingPlcHdr/>
                 <w:dropDownList>
@@ -2424,7 +2418,7 @@
                 </w:rPr>
                 <w:alias w:val="Situação 1.17"/>
                 <w:tag w:val="situação_1.17"/>
-                <w:id w:val="1032"/>
+                <w:id w:val="1029"/>
                 <w:lock w:val="sdtLocked"/>
                 <w:showingPlcHdr/>
                 <w:dropDownList>
@@ -2519,7 +2513,7 @@
                 </w:rPr>
                 <w:alias w:val="Situação 1.18"/>
                 <w:tag w:val="situação_1.18"/>
-                <w:id w:val="1033"/>
+                <w:id w:val="1030"/>
                 <w:lock w:val="sdtLocked"/>
                 <w:showingPlcHdr/>
                 <w:dropDownList>
@@ -2614,7 +2608,7 @@
                 </w:rPr>
                 <w:alias w:val="Situação 1.19"/>
                 <w:tag w:val="situação_1.19"/>
-                <w:id w:val="1034"/>
+                <w:id w:val="1031"/>
                 <w:lock w:val="sdtLocked"/>
                 <w:showingPlcHdr/>
                 <w:dropDownList>
@@ -2709,7 +2703,7 @@
                 </w:rPr>
                 <w:alias w:val="Situação 1.20"/>
                 <w:tag w:val="situação_1.20"/>
-                <w:id w:val="1035"/>
+                <w:id w:val="1032"/>
                 <w:lock w:val="sdtLocked"/>
                 <w:showingPlcHdr/>
                 <w:dropDownList>
@@ -2804,7 +2798,7 @@
                 </w:rPr>
                 <w:alias w:val="Situação 1.21"/>
                 <w:tag w:val="situação_1.21"/>
-                <w:id w:val="1036"/>
+                <w:id w:val="1033"/>
                 <w:lock w:val="sdtLocked"/>
                 <w:showingPlcHdr/>
                 <w:dropDownList>
@@ -2899,7 +2893,7 @@
                 </w:rPr>
                 <w:alias w:val="Situação 1.22"/>
                 <w:tag w:val="situação_1.22"/>
-                <w:id w:val="1037"/>
+                <w:id w:val="1034"/>
                 <w:lock w:val="sdtLocked"/>
                 <w:showingPlcHdr/>
                 <w:dropDownList>
@@ -2994,7 +2988,7 @@
                 </w:rPr>
                 <w:alias w:val="Situação 1.23"/>
                 <w:tag w:val="situação_1.23"/>
-                <w:id w:val="1038"/>
+                <w:id w:val="1035"/>
                 <w:lock w:val="sdtLocked"/>
                 <w:showingPlcHdr/>
                 <w:dropDownList>
@@ -3089,7 +3083,7 @@
                 </w:rPr>
                 <w:alias w:val="Situação 1.24"/>
                 <w:tag w:val="situação_1.24"/>
-                <w:id w:val="1039"/>
+                <w:id w:val="1036"/>
                 <w:lock w:val="sdtLocked"/>
                 <w:showingPlcHdr/>
                 <w:dropDownList>
@@ -3184,7 +3178,7 @@
                 </w:rPr>
                 <w:alias w:val="Situação 1.25"/>
                 <w:tag w:val="situação_1.25"/>
-                <w:id w:val="1040"/>
+                <w:id w:val="1037"/>
                 <w:lock w:val="sdtLocked"/>
                 <w:showingPlcHdr/>
                 <w:dropDownList>
@@ -3279,7 +3273,7 @@
                 </w:rPr>
                 <w:alias w:val="Situação 1.26"/>
                 <w:tag w:val="situação_1.26"/>
-                <w:id w:val="1041"/>
+                <w:id w:val="1038"/>
                 <w:lock w:val="sdtLocked"/>
                 <w:showingPlcHdr/>
                 <w:dropDownList>
@@ -3374,7 +3368,7 @@
                 </w:rPr>
                 <w:alias w:val="Situação 1.27"/>
                 <w:tag w:val="situação_1.27"/>
-                <w:id w:val="1042"/>
+                <w:id w:val="1039"/>
                 <w:lock w:val="sdtLocked"/>
                 <w:showingPlcHdr/>
                 <w:dropDownList>
@@ -3499,7 +3493,7 @@
                 </w:rPr>
                 <w:alias w:val="Situação 2.1"/>
                 <w:tag w:val="situação_2.1"/>
-                <w:id w:val="1043"/>
+                <w:id w:val="1040"/>
                 <w:lock w:val="sdtLocked"/>
                 <w:showingPlcHdr/>
                 <w:dropDownList>
@@ -3594,7 +3588,7 @@
                 </w:rPr>
                 <w:alias w:val="Situação 2.2"/>
                 <w:tag w:val="situação_2.2"/>
-                <w:id w:val="1044"/>
+                <w:id w:val="1041"/>
                 <w:lock w:val="sdtLocked"/>
                 <w:showingPlcHdr/>
                 <w:dropDownList>
@@ -3689,7 +3683,7 @@
                 </w:rPr>
                 <w:alias w:val="Situação 2.3"/>
                 <w:tag w:val="situação_2.3"/>
-                <w:id w:val="1045"/>
+                <w:id w:val="1042"/>
                 <w:lock w:val="sdtLocked"/>
                 <w:showingPlcHdr/>
                 <w:dropDownList>
@@ -3784,7 +3778,7 @@
                 </w:rPr>
                 <w:alias w:val="Situação 2.4"/>
                 <w:tag w:val="situação_2.4"/>
-                <w:id w:val="1046"/>
+                <w:id w:val="1043"/>
                 <w:lock w:val="sdtLocked"/>
                 <w:showingPlcHdr/>
                 <w:dropDownList>
@@ -3879,7 +3873,7 @@
                 </w:rPr>
                 <w:alias w:val="Situação 2.5"/>
                 <w:tag w:val="situação_2.5"/>
-                <w:id w:val="1047"/>
+                <w:id w:val="1044"/>
                 <w:lock w:val="sdtLocked"/>
                 <w:showingPlcHdr/>
                 <w:dropDownList>
@@ -4004,7 +3998,7 @@
                 </w:rPr>
                 <w:alias w:val="Situação 3.1"/>
                 <w:tag w:val="situação_3.1"/>
-                <w:id w:val="1048"/>
+                <w:id w:val="1045"/>
                 <w:lock w:val="sdtLocked"/>
                 <w:showingPlcHdr/>
                 <w:dropDownList>
@@ -4099,7 +4093,7 @@
                 </w:rPr>
                 <w:alias w:val="Situação 3.2"/>
                 <w:tag w:val="situação_3.2"/>
-                <w:id w:val="1049"/>
+                <w:id w:val="1046"/>
                 <w:lock w:val="sdtLocked"/>
                 <w:showingPlcHdr/>
                 <w:dropDownList>
@@ -4194,7 +4188,7 @@
                 </w:rPr>
                 <w:alias w:val="Situação 3.3"/>
                 <w:tag w:val="situação_3.3"/>
-                <w:id w:val="1050"/>
+                <w:id w:val="1047"/>
                 <w:lock w:val="sdtLocked"/>
                 <w:showingPlcHdr/>
                 <w:dropDownList>
@@ -4289,7 +4283,7 @@
                 </w:rPr>
                 <w:alias w:val="Situação 3.4"/>
                 <w:tag w:val="situação_3.4"/>
-                <w:id w:val="1051"/>
+                <w:id w:val="1048"/>
                 <w:lock w:val="sdtLocked"/>
                 <w:showingPlcHdr/>
                 <w:dropDownList>
@@ -4384,7 +4378,7 @@
                 </w:rPr>
                 <w:alias w:val="Situação 3.5"/>
                 <w:tag w:val="situação_3.5"/>
-                <w:id w:val="1052"/>
+                <w:id w:val="1049"/>
                 <w:lock w:val="sdtLocked"/>
                 <w:showingPlcHdr/>
                 <w:dropDownList>
@@ -4479,7 +4473,7 @@
                 </w:rPr>
                 <w:alias w:val="Situação 3.6"/>
                 <w:tag w:val="situação_3.6"/>
-                <w:id w:val="1053"/>
+                <w:id w:val="1050"/>
                 <w:lock w:val="sdtLocked"/>
                 <w:showingPlcHdr/>
                 <w:dropDownList>
@@ -4574,7 +4568,7 @@
                 </w:rPr>
                 <w:alias w:val="Situação 3.7"/>
                 <w:tag w:val="situação_3.7"/>
-                <w:id w:val="1054"/>
+                <w:id w:val="1051"/>
                 <w:lock w:val="sdtLocked"/>
                 <w:showingPlcHdr/>
                 <w:dropDownList>
@@ -4669,7 +4663,7 @@
                 </w:rPr>
                 <w:alias w:val="Situação 3.8"/>
                 <w:tag w:val="situação_3.8"/>
-                <w:id w:val="1055"/>
+                <w:id w:val="1052"/>
                 <w:lock w:val="sdtLocked"/>
                 <w:showingPlcHdr/>
                 <w:dropDownList>
@@ -4764,7 +4758,7 @@
                 </w:rPr>
                 <w:alias w:val="Situação 3.9"/>
                 <w:tag w:val="situação_3.9"/>
-                <w:id w:val="1056"/>
+                <w:id w:val="1053"/>
                 <w:lock w:val="sdtLocked"/>
                 <w:showingPlcHdr/>
                 <w:dropDownList>
@@ -4859,7 +4853,7 @@
                 </w:rPr>
                 <w:alias w:val="Situação 3.10"/>
                 <w:tag w:val="situação_3.10"/>
-                <w:id w:val="1057"/>
+                <w:id w:val="1054"/>
                 <w:lock w:val="sdtLocked"/>
                 <w:showingPlcHdr/>
                 <w:dropDownList>
@@ -4954,7 +4948,7 @@
                 </w:rPr>
                 <w:alias w:val="Situação 3.11"/>
                 <w:tag w:val="situação_3.11"/>
-                <w:id w:val="1058"/>
+                <w:id w:val="1055"/>
                 <w:lock w:val="sdtLocked"/>
                 <w:showingPlcHdr/>
                 <w:dropDownList>
@@ -5049,7 +5043,7 @@
                 </w:rPr>
                 <w:alias w:val="Situação 3.12"/>
                 <w:tag w:val="situação_3.12"/>
-                <w:id w:val="1059"/>
+                <w:id w:val="1056"/>
                 <w:lock w:val="sdtLocked"/>
                 <w:showingPlcHdr/>
                 <w:dropDownList>
@@ -5174,7 +5168,7 @@
                 </w:rPr>
                 <w:alias w:val="Situação 4.1"/>
                 <w:tag w:val="situação_4.1"/>
-                <w:id w:val="1060"/>
+                <w:id w:val="1057"/>
                 <w:lock w:val="sdtLocked"/>
                 <w:showingPlcHdr/>
                 <w:dropDownList>
@@ -5269,7 +5263,7 @@
                 </w:rPr>
                 <w:alias w:val="Situação 4.2"/>
                 <w:tag w:val="situação_4.2"/>
-                <w:id w:val="1061"/>
+                <w:id w:val="1058"/>
                 <w:lock w:val="sdtLocked"/>
                 <w:showingPlcHdr/>
                 <w:dropDownList>
@@ -5364,7 +5358,7 @@
                 </w:rPr>
                 <w:alias w:val="Situação 4.3"/>
                 <w:tag w:val="situação_4.3"/>
-                <w:id w:val="1062"/>
+                <w:id w:val="1059"/>
                 <w:lock w:val="sdtLocked"/>
                 <w:showingPlcHdr/>
                 <w:dropDownList>
@@ -5459,7 +5453,7 @@
                 </w:rPr>
                 <w:alias w:val="Situação 4.4"/>
                 <w:tag w:val="situação_4.4"/>
-                <w:id w:val="1063"/>
+                <w:id w:val="1060"/>
                 <w:lock w:val="sdtLocked"/>
                 <w:showingPlcHdr/>
                 <w:dropDownList>
@@ -5584,7 +5578,7 @@
                 </w:rPr>
                 <w:alias w:val="Situação 5.1"/>
                 <w:tag w:val="situação_5.1"/>
-                <w:id w:val="1064"/>
+                <w:id w:val="1061"/>
                 <w:lock w:val="sdtLocked"/>
                 <w:showingPlcHdr/>
                 <w:dropDownList>
@@ -5679,7 +5673,7 @@
                 </w:rPr>
                 <w:alias w:val="Situação 5.2"/>
                 <w:tag w:val="situação_5.2"/>
-                <w:id w:val="1065"/>
+                <w:id w:val="1062"/>
                 <w:lock w:val="sdtLocked"/>
                 <w:showingPlcHdr/>
                 <w:dropDownList>
@@ -5852,7 +5846,7 @@
           </w:rPr>
           <w:alias w:val="Convocação nº"/>
           <w:tag w:val="convocação_nº"/>
-          <w:id w:val="1066"/>
+          <w:id w:val="1063"/>
           <w:lock w:val="sdtLocked"/>
           <w:showingPlcHdr/>
           <w:text/>
@@ -5885,7 +5879,7 @@
           </w:rPr>
           <w:alias w:val="Data da convocação"/>
           <w:tag w:val="data_da_convocação"/>
-          <w:id w:val="1067"/>
+          <w:id w:val="1064"/>
           <w:lock w:val="sdtLocked"/>
           <w:showingPlcHdr/>
           <w:date>
@@ -5923,7 +5917,7 @@
           </w:rPr>
           <w:alias w:val="Tipo de ensaio"/>
           <w:tag w:val="tipo_de_ensaio"/>
-          <w:id w:val="1068"/>
+          <w:id w:val="1065"/>
           <w:lock w:val="sdtLocked"/>
           <w:showingPlcHdr/>
           <w:comboBox>
@@ -6147,7 +6141,7 @@
                 </w:rPr>
                 <w:alias w:val="Código do PICQ"/>
                 <w:tag w:val="código_do_picq"/>
-                <w:id w:val="1069"/>
+                <w:id w:val="1066"/>
                 <w:lock w:val="sdtLocked"/>
                 <w:showingPlcHdr/>
                 <w:text/>
@@ -6202,7 +6196,7 @@
                 </w:rPr>
                 <w:alias w:val="Rev. PICQ"/>
                 <w:tag w:val="rev._picq"/>
-                <w:id w:val="1070"/>
+                <w:id w:val="1067"/>
                 <w:lock w:val="sdtLocked"/>
                 <w:showingPlcHdr/>
                 <w:text/>
@@ -6242,7 +6236,7 @@
                 </w:rPr>
                 <w:alias w:val="Norma ABNT / IEC"/>
                 <w:tag w:val="norma_abnt_/_iec"/>
-                <w:id w:val="1071"/>
+                <w:id w:val="1068"/>
                 <w:lock w:val="sdtLocked"/>
                 <w:showingPlcHdr/>
                 <w:text/>
@@ -6277,7 +6271,7 @@
                 </w:rPr>
                 <w:alias w:val="Título da norma"/>
                 <w:tag w:val="título_da_norma"/>
-                <w:id w:val="1072"/>
+                <w:id w:val="1069"/>
                 <w:lock w:val="sdtLocked"/>
                 <w:showingPlcHdr/>
                 <w:text/>
@@ -6312,7 +6306,7 @@
                 </w:rPr>
                 <w:alias w:val="Ano norma"/>
                 <w:tag w:val="ano_norma"/>
-                <w:id w:val="1073"/>
+                <w:id w:val="1070"/>
                 <w:lock w:val="sdtLocked"/>
                 <w:showingPlcHdr/>
                 <w:text/>
@@ -6352,7 +6346,7 @@
                 </w:rPr>
                 <w:alias w:val="ET do cliente"/>
                 <w:tag w:val="et_do_cliente"/>
-                <w:id w:val="1074"/>
+                <w:id w:val="1071"/>
                 <w:lock w:val="sdtLocked"/>
                 <w:showingPlcHdr/>
                 <w:text/>
@@ -6387,7 +6381,7 @@
                 </w:rPr>
                 <w:alias w:val="Título ET"/>
                 <w:tag w:val="título_et"/>
-                <w:id w:val="1075"/>
+                <w:id w:val="1072"/>
                 <w:lock w:val="sdtLocked"/>
                 <w:showingPlcHdr/>
                 <w:text/>
@@ -6422,7 +6416,7 @@
                 </w:rPr>
                 <w:alias w:val="Rev. ET"/>
                 <w:tag w:val="rev._et"/>
-                <w:id w:val="1076"/>
+                <w:id w:val="1073"/>
                 <w:lock w:val="sdtLocked"/>
                 <w:showingPlcHdr/>
                 <w:text/>
@@ -6462,7 +6456,7 @@
                 </w:rPr>
                 <w:alias w:val="Desenho / lista de materiais"/>
                 <w:tag w:val="desenho_/_lista_de_materiais"/>
-                <w:id w:val="1077"/>
+                <w:id w:val="1074"/>
                 <w:lock w:val="sdtLocked"/>
                 <w:showingPlcHdr/>
                 <w:text/>
@@ -6497,7 +6491,7 @@
                 </w:rPr>
                 <w:alias w:val="Título desenho"/>
                 <w:tag w:val="título_desenho"/>
-                <w:id w:val="1078"/>
+                <w:id w:val="1075"/>
                 <w:lock w:val="sdtLocked"/>
                 <w:showingPlcHdr/>
                 <w:text/>
@@ -6532,7 +6526,7 @@
                 </w:rPr>
                 <w:alias w:val="Rev. desenho"/>
                 <w:tag w:val="rev._desenho"/>
-                <w:id w:val="1079"/>
+                <w:id w:val="1076"/>
                 <w:lock w:val="sdtLocked"/>
                 <w:showingPlcHdr/>
                 <w:text/>
@@ -6745,7 +6739,7 @@
                 </w:rPr>
                 <w:alias w:val="Descrição do equipamento"/>
                 <w:tag w:val="descrição_do_equipamento"/>
-                <w:id w:val="1080"/>
+                <w:id w:val="1077"/>
                 <w:lock w:val="sdtLocked"/>
                 <w:showingPlcHdr/>
                 <w:text/>
@@ -6780,7 +6774,7 @@
                 </w:rPr>
                 <w:alias w:val="Nº de série"/>
                 <w:tag w:val="nº_de_série"/>
-                <w:id w:val="1081"/>
+                <w:id w:val="1078"/>
                 <w:lock w:val="sdtLocked"/>
                 <w:showingPlcHdr/>
                 <w:text/>
@@ -6815,7 +6809,7 @@
                 </w:rPr>
                 <w:alias w:val="Qtd."/>
                 <w:tag w:val="qtd."/>
-                <w:id w:val="1082"/>
+                <w:id w:val="1079"/>
                 <w:lock w:val="sdtLocked"/>
                 <w:showingPlcHdr/>
                 <w:text/>
@@ -7069,7 +7063,7 @@
                 </w:rPr>
                 <w:alias w:val="Pendência 1"/>
                 <w:tag w:val="pendência_1"/>
-                <w:id w:val="1083"/>
+                <w:id w:val="1080"/>
                 <w:lock w:val="sdtLocked"/>
                 <w:showingPlcHdr/>
                 <w:text/>
@@ -7104,6 +7098,143 @@
                 </w:rPr>
                 <w:alias w:val="Responsável 1"/>
                 <w:tag w:val="responsável_1"/>
+                <w:id w:val="1081"/>
+                <w:lock w:val="sdtLocked"/>
+                <w:showingPlcHdr/>
+                <w:text/>
+              </w:sdtPr>
+              <w:sdtContent>
+                <w:r>
+                  <w:rPr>
+                    <w:i/>
+                    <w:color w:val="8A8B8E"/>
+                    <w:sz w:val="18"/>
+                  </w:rPr>
+                  <w:t xml:space="preserve">Responsável</w:t>
+                </w:r>
+              </w:sdtContent>
+            </w:sdt>
+          </w:p>
+        </w:tc>
+        <w:tc>
+          <w:tcPr>
+            <w:tcW w:type="dxa" w:w="1587"/>
+            <w:vAlign w:val="center"/>
+          </w:tcPr>
+          <w:p>
+            <w:pPr>
+              <w:jc w:val="center"/>
+            </w:pPr>
+            <w:sdt>
+              <w:sdtPr>
+                <w:rPr>
+                  <w:b/>
+                  <w:color w:val="2B2C2E"/>
+                  <w:sz w:val="17"/>
+                </w:rPr>
+                <w:alias w:val="Status pendência"/>
+                <w:tag w:val="status_pendência"/>
+                <w:id w:val="1082"/>
+                <w:lock w:val="sdtLocked"/>
+                <w:showingPlcHdr/>
+                <w:dropDownList>
+                  <w:listItem w:displayText="Aberta" w:value="Aberta"/>
+                  <w:listItem w:displayText="Em tratamento" w:value="Em tratamento"/>
+                  <w:listItem w:displayText="Encerrada" w:value="Encerrada"/>
+                  <w:listItem w:displayText="N/A" w:value="N/A"/>
+                </w:dropDownList>
+              </w:sdtPr>
+              <w:sdtContent>
+                <w:r>
+                  <w:rPr>
+                    <w:b/>
+                    <w:i/>
+                    <w:color w:val="8A8B8E"/>
+                    <w:sz w:val="17"/>
+                  </w:rPr>
+                  <w:t xml:space="preserve">Escolher ▾</w:t>
+                </w:r>
+              </w:sdtContent>
+            </w:sdt>
+          </w:p>
+        </w:tc>
+      </w:tr>
+      <w:tr>
+        <w:trPr>
+          <w:trHeight w:val="283"/>
+        </w:trPr>
+        <w:tc>
+          <w:tcPr>
+            <w:tcW w:type="dxa" w:w="567"/>
+            <w:vAlign w:val="center"/>
+          </w:tcPr>
+          <w:p>
+            <w:pPr>
+              <w:spacing w:after="0" w:before="0"/>
+            </w:pPr>
+            <w:r>
+              <w:rPr>
+                <w:b w:val="0"/>
+                <w:i w:val="0"/>
+                <w:color w:val="2B2C2E"/>
+                <w:sz w:val="18"/>
+              </w:rPr>
+              <w:t>02</w:t>
+            </w:r>
+          </w:p>
+        </w:tc>
+        <w:tc>
+          <w:tcPr>
+            <w:tcW w:type="dxa" w:w="5669"/>
+            <w:vAlign w:val="center"/>
+          </w:tcPr>
+          <w:p>
+            <w:pPr>
+              <w:spacing w:after="0"/>
+            </w:pPr>
+            <w:sdt>
+              <w:sdtPr>
+                <w:rPr>
+                  <w:color w:val="2B2C2E"/>
+                  <w:sz w:val="18"/>
+                </w:rPr>
+                <w:alias w:val="Pendência 2"/>
+                <w:tag w:val="pendência_2"/>
+                <w:id w:val="1083"/>
+                <w:lock w:val="sdtLocked"/>
+                <w:showingPlcHdr/>
+                <w:text/>
+              </w:sdtPr>
+              <w:sdtContent>
+                <w:r>
+                  <w:rPr>
+                    <w:i/>
+                    <w:color w:val="8A8B8E"/>
+                    <w:sz w:val="18"/>
+                  </w:rPr>
+                  <w:t xml:space="preserve">Descrever a pendência ou “Não há”</w:t>
+                </w:r>
+              </w:sdtContent>
+            </w:sdt>
+          </w:p>
+        </w:tc>
+        <w:tc>
+          <w:tcPr>
+            <w:tcW w:type="dxa" w:w="1814"/>
+            <w:vAlign w:val="center"/>
+          </w:tcPr>
+          <w:p>
+            <w:pPr>
+              <w:spacing w:after="0"/>
+            </w:pPr>
+            <w:sdt>
+              <w:sdtPr>
+                <w:rPr>
+                  <w:color w:val="2B2C2E"/>
+                  <w:sz w:val="18"/>
+                </w:rPr>
+                <w:alias w:val="Responsável 2"/>
+                <w:tag w:val="responsável_2"/>
                 <w:id w:val="1084"/>
                 <w:lock w:val="sdtLocked"/>
                 <w:showingPlcHdr/>
@@ -7185,7 +7316,7 @@
                 <w:color w:val="2B2C2E"/>
                 <w:sz w:val="18"/>
               </w:rPr>
-              <w:t>02</w:t>
+              <w:t>03</w:t>
             </w:r>
           </w:p>
         </w:tc>
@@ -7204,8 +7335,8 @@
                   <w:color w:val="2B2C2E"/>
                   <w:sz w:val="18"/>
                 </w:rPr>
-                <w:alias w:val="Pendência 2"/>
-                <w:tag w:val="pendência_2"/>
+                <w:alias w:val="Pendência 3"/>
+                <w:tag w:val="pendência_3"/>
                 <w:id w:val="1086"/>
                 <w:lock w:val="sdtLocked"/>
                 <w:showingPlcHdr/>
@@ -7239,8 +7370,8 @@
                   <w:color w:val="2B2C2E"/>
                   <w:sz w:val="18"/>
                 </w:rPr>
-                <w:alias w:val="Responsável 2"/>
-                <w:tag w:val="responsável_2"/>
+                <w:alias w:val="Responsável 3"/>
+                <w:tag w:val="responsável_3"/>
                 <w:id w:val="1087"/>
                 <w:lock w:val="sdtLocked"/>
                 <w:showingPlcHdr/>
@@ -7278,143 +7409,6 @@
                 <w:alias w:val="Status pendência"/>
                 <w:tag w:val="status_pendência"/>
                 <w:id w:val="1088"/>
-                <w:lock w:val="sdtLocked"/>
-                <w:showingPlcHdr/>
-                <w:dropDownList>
-                  <w:listItem w:displayText="Aberta" w:value="Aberta"/>
-                  <w:listItem w:displayText="Em tratamento" w:value="Em tratamento"/>
-                  <w:listItem w:displayText="Encerrada" w:value="Encerrada"/>
-                  <w:listItem w:displayText="N/A" w:value="N/A"/>
-                </w:dropDownList>
-              </w:sdtPr>
-              <w:sdtContent>
-                <w:r>
-                  <w:rPr>
-                    <w:b/>
-                    <w:i/>
-                    <w:color w:val="8A8B8E"/>
-                    <w:sz w:val="17"/>
-                  </w:rPr>
-                  <w:t xml:space="preserve">Escolher ▾</w:t>
-                </w:r>
-              </w:sdtContent>
-            </w:sdt>
-          </w:p>
-        </w:tc>
-      </w:tr>
-      <w:tr>
-        <w:trPr>
-          <w:trHeight w:val="283"/>
-        </w:trPr>
-        <w:tc>
-          <w:tcPr>
-            <w:tcW w:type="dxa" w:w="567"/>
-            <w:vAlign w:val="center"/>
-          </w:tcPr>
-          <w:p>
-            <w:pPr>
-              <w:spacing w:after="0" w:before="0"/>
-            </w:pPr>
-            <w:r>
-              <w:rPr>
-                <w:b w:val="0"/>
-                <w:i w:val="0"/>
-                <w:color w:val="2B2C2E"/>
-                <w:sz w:val="18"/>
-              </w:rPr>
-              <w:t>03</w:t>
-            </w:r>
-          </w:p>
-        </w:tc>
-        <w:tc>
-          <w:tcPr>
-            <w:tcW w:type="dxa" w:w="5669"/>
-            <w:vAlign w:val="center"/>
-          </w:tcPr>
-          <w:p>
-            <w:pPr>
-              <w:spacing w:after="0"/>
-            </w:pPr>
-            <w:sdt>
-              <w:sdtPr>
-                <w:rPr>
-                  <w:color w:val="2B2C2E"/>
-                  <w:sz w:val="18"/>
-                </w:rPr>
-                <w:alias w:val="Pendência 3"/>
-                <w:tag w:val="pendência_3"/>
-                <w:id w:val="1089"/>
-                <w:lock w:val="sdtLocked"/>
-                <w:showingPlcHdr/>
-                <w:text/>
-              </w:sdtPr>
-              <w:sdtContent>
-                <w:r>
-                  <w:rPr>
-                    <w:i/>
-                    <w:color w:val="8A8B8E"/>
-                    <w:sz w:val="18"/>
-                  </w:rPr>
-                  <w:t xml:space="preserve">Descrever a pendência ou “Não há”</w:t>
-                </w:r>
-              </w:sdtContent>
-            </w:sdt>
-          </w:p>
-        </w:tc>
-        <w:tc>
-          <w:tcPr>
-            <w:tcW w:type="dxa" w:w="1814"/>
-            <w:vAlign w:val="center"/>
-          </w:tcPr>
-          <w:p>
-            <w:pPr>
-              <w:spacing w:after="0"/>
-            </w:pPr>
-            <w:sdt>
-              <w:sdtPr>
-                <w:rPr>
-                  <w:color w:val="2B2C2E"/>
-                  <w:sz w:val="18"/>
-                </w:rPr>
-                <w:alias w:val="Responsável 3"/>
-                <w:tag w:val="responsável_3"/>
-                <w:id w:val="1090"/>
-                <w:lock w:val="sdtLocked"/>
-                <w:showingPlcHdr/>
-                <w:text/>
-              </w:sdtPr>
-              <w:sdtContent>
-                <w:r>
-                  <w:rPr>
-                    <w:i/>
-                    <w:color w:val="8A8B8E"/>
-                    <w:sz w:val="18"/>
-                  </w:rPr>
-                  <w:t xml:space="preserve">Responsável</w:t>
-                </w:r>
-              </w:sdtContent>
-            </w:sdt>
-          </w:p>
-        </w:tc>
-        <w:tc>
-          <w:tcPr>
-            <w:tcW w:type="dxa" w:w="1587"/>
-            <w:vAlign w:val="center"/>
-          </w:tcPr>
-          <w:p>
-            <w:pPr>
-              <w:jc w:val="center"/>
-            </w:pPr>
-            <w:sdt>
-              <w:sdtPr>
-                <w:rPr>
-                  <w:b/>
-                  <w:color w:val="2B2C2E"/>
-                  <w:sz w:val="17"/>
-                </w:rPr>
-                <w:alias w:val="Status pendência"/>
-                <w:tag w:val="status_pendência"/>
-                <w:id w:val="1091"/>
                 <w:lock w:val="sdtLocked"/>
                 <w:showingPlcHdr/>
                 <w:dropDownList>
@@ -7633,6 +7627,185 @@
                 </w:rPr>
                 <w:alias w:val="Ensaio testemunhado"/>
                 <w:tag w:val="ensaio_testemunhado"/>
+                <w:id w:val="1089"/>
+                <w:lock w:val="sdtLocked"/>
+                <w:comboBox>
+                  <w:listItem w:displayText="Fator de potência do isolamento e capacitância das buchas" w:value="Fator de potência do isolamento e capacitância das buchas"/>
+                  <w:listItem w:displayText="Resistência de isolamento dos enrolamentos" w:value="Resistência de isolamento dos enrolamentos"/>
+                  <w:listItem w:displayText="Resistência de isolamento do núcleo" w:value="Resistência de isolamento do núcleo"/>
+                  <w:listItem w:displayText="Relação de transformação: AT × BT; BT × terciário; AT × terciário" w:value="Relação de transformação: AT × BT; BT × terciário; AT × terciário"/>
+                  <w:listItem w:displayText="Resistência ôhmica dos enrolamentos de AT, BT e terciário" w:value="Resistência ôhmica dos enrolamentos de AT, BT e terciário"/>
+                  <w:listItem w:displayText="Relação de transformação dos TCs" w:value="Relação de transformação dos TCs"/>
+                  <w:listItem w:displayText="Resistência de enrolamento dos TCs" w:value="Resistência de enrolamento dos TCs"/>
+                  <w:listItem w:displayText="Resistência de isolamento dos TCs" w:value="Resistência de isolamento dos TCs"/>
+                  <w:listItem w:displayText="Aspecto visual" w:value="Aspecto visual"/>
+                  <w:listItem w:displayText="Dimensional" w:value="Dimensional"/>
+                  <w:listItem w:displayText="Resistência dos enrolamentos em todas as derivações do CDC" w:value="Resistência dos enrolamentos em todas as derivações do CDC"/>
+                  <w:listItem w:displayText="Relação de transformação" w:value="Relação de transformação"/>
+                  <w:listItem w:displayText="Polaridade" w:value="Polaridade"/>
+                  <w:listItem w:displayText="Deslocamento angular" w:value="Deslocamento angular"/>
+                  <w:listItem w:displayText="Sequência de fases" w:value="Sequência de fases"/>
+                  <w:listItem w:displayText="Resistência de isolamento do núcleo e armadura" w:value="Resistência de isolamento do núcleo e armadura"/>
+                  <w:listItem w:displayText="Perdas em carga e impedância de curto-circuito com ciclo de comutação" w:value="Perdas em carga e impedância de curto-circuito com ciclo de comutação"/>
+                  <w:listItem w:displayText="Perdas em vazio e corrente de excitação" w:value="Perdas em vazio e corrente de excitação"/>
+                  <w:listItem w:displayText="Perdas em vazio e corrente de excitação (antes dos dielétricos)" w:value="Perdas em vazio e corrente de excitação (antes dos dielétricos)"/>
+                  <w:listItem w:displayText="Perdas em vazio e corrente de excitação (após os dielétricos) com ciclo de comutação a vazio" w:value="Perdas em vazio e corrente de excitação (após os dielétricos) com ciclo de comutação a vazio"/>
+                  <w:listItem w:displayText="Levantamento da curva de saturação" w:value="Levantamento da curva de saturação"/>
+                  <w:listItem w:displayText="Impulso atmosférico alta tensão e H0" w:value="Impulso atmosférico alta tensão e H0"/>
+                  <w:listItem w:displayText="Impulso atmosférico baixa tensão e X0" w:value="Impulso atmosférico baixa tensão e X0"/>
+                  <w:listItem w:displayText="Impulso atmosférico terciário" w:value="Impulso atmosférico terciário"/>
+                  <w:listItem w:displayText="Impulso de manobra" w:value="Impulso de manobra"/>
+                  <w:listItem w:displayText="Tensão induzida de longa duração com medição de descargas parciais" w:value="Tensão induzida de longa duração com medição de descargas parciais"/>
+                  <w:listItem w:displayText="Tensão aplicada à frequência industrial" w:value="Tensão aplicada à frequência industrial"/>
+                  <w:listItem w:displayText="Estanqueidade e resistência à pressão" w:value="Estanqueidade e resistência à pressão"/>
+                  <w:listItem w:displayText="Capacitância entre enrolamentos e terra e entre enrolamentos (fator de potência)" w:value="Capacitância entre enrolamentos e terra e entre enrolamentos (fator de potência)"/>
+                  <w:listItem w:displayText="Capacitância e fator de potência das buchas" w:value="Capacitância e fator de potência das buchas"/>
+                  <w:listItem w:displayText="Resposta em frequência" w:value="Resposta em frequência"/>
+                  <w:listItem w:displayText="Impedância terminal" w:value="Impedância terminal"/>
+                  <w:listItem w:displayText="Ponto de orvalho (URSI)" w:value="Ponto de orvalho (URSI)"/>
+                  <w:listItem w:displayText="Vácuo e deformação" w:value="Vácuo e deformação"/>
+                  <w:listItem w:displayText="Relação de transformação" w:value="Relação de transformação"/>
+                  <w:listItem w:displayText="Polaridade" w:value="Polaridade"/>
+                  <w:listItem w:displayText="Resistência elétrica dos enrolamentos" w:value="Resistência elétrica dos enrolamentos"/>
+                  <w:listItem w:displayText="Tensão aplicada à frequência industrial" w:value="Tensão aplicada à frequência industrial"/>
+                  <w:listItem w:displayText="Resistência de isolamento" w:value="Resistência de isolamento"/>
+                  <w:listItem w:displayText="Aspecto dos acessórios e fiação" w:value="Aspecto dos acessórios e fiação"/>
+                  <w:listItem w:displayText="Funcional dos acessórios" w:value="Funcional dos acessórios"/>
+                  <w:listItem w:displayText="Tensão aplicada à frequência industrial nos componentes e circuitos" w:value="Tensão aplicada à frequência industrial nos componentes e circuitos"/>
+                  <w:listItem w:displayText="Continuidade dos circuitos elétricos de comando, controle, proteção e medição" w:value="Continuidade dos circuitos elétricos de comando, controle, proteção e medição"/>
+                  <w:listItem w:displayText="Funcional do comutador" w:value="Funcional do comutador"/>
+                  <w:listItem w:displayText="Resistência de isolamento" w:value="Resistência de isolamento"/>
+                  <w:listItem w:displayText="Endereçamento da fiação (anilhamento)" w:value="Endereçamento da fiação (anilhamento)"/>
+                  <w:listItem w:displayText="Ajuste da imagem térmica" w:value="Ajuste da imagem térmica"/>
+                  <w:listItem w:displayText="Verificação dimensional" w:value="Verificação dimensional"/>
+                  <w:listItem w:displayText="Verificação da lista de materiais" w:value="Verificação da lista de materiais"/>
+                  <w:listItem w:displayText="Verificação da aderência da camada de pintura" w:value="Verificação da aderência da camada de pintura"/>
+                  <w:listItem w:displayText="Verificação da espessura total da camada de pintura" w:value="Verificação da espessura total da camada de pintura"/>
+                  <w:listItem w:displayText="Físico-químico – inicial" w:value="Físico-químico – inicial"/>
+                  <w:listItem w:displayText="Físico-químico – final" w:value="Físico-químico – final"/>
+                  <w:listItem w:displayText="Cromatografia – antes dos dielétricos" w:value="Cromatografia – antes dos dielétricos"/>
+                  <w:listItem w:displayText="Cromatografia – após os dielétricos" w:value="Cromatografia – após os dielétricos"/>
+                  <w:listItem w:displayText="Espessura de película seca" w:value="Espessura de película seca"/>
+                  <w:listItem w:displayText="Aderência" w:value="Aderência"/>
+                </w:comboBox>
+              </w:sdtPr>
+              <w:sdtContent>
+                <w:r>
+                  <w:rPr>
+                    <w:color w:val="2B2C2E"/>
+                    <w:sz w:val="18"/>
+                  </w:rPr>
+                  <w:t xml:space="preserve">Fator de potência do isolamento e capacitância das buchas</w:t>
+                </w:r>
+              </w:sdtContent>
+            </w:sdt>
+          </w:p>
+        </w:tc>
+        <w:tc>
+          <w:tcPr>
+            <w:tcW w:type="dxa" w:w="2381"/>
+            <w:vAlign w:val="center"/>
+          </w:tcPr>
+          <w:p>
+            <w:pPr>
+              <w:spacing w:after="0"/>
+            </w:pPr>
+            <w:sdt>
+              <w:sdtPr>
+                <w:rPr>
+                  <w:color w:val="2B2C2E"/>
+                  <w:sz w:val="18"/>
+                </w:rPr>
+                <w:alias w:val="Evidência"/>
+                <w:tag w:val="evidência"/>
+                <w:id w:val="1090"/>
+                <w:lock w:val="sdtLocked"/>
+                <w:showingPlcHdr/>
+                <w:text/>
+              </w:sdtPr>
+              <w:sdtContent>
+                <w:r>
+                  <w:rPr>
+                    <w:i/>
+                    <w:color w:val="8A8B8E"/>
+                    <w:sz w:val="18"/>
+                  </w:rPr>
+                  <w:t xml:space="preserve">Foto nº / boletim</w:t>
+                </w:r>
+              </w:sdtContent>
+            </w:sdt>
+          </w:p>
+        </w:tc>
+        <w:tc>
+          <w:tcPr>
+            <w:tcW w:type="dxa" w:w="1587"/>
+            <w:vAlign w:val="center"/>
+          </w:tcPr>
+          <w:p>
+            <w:pPr>
+              <w:jc w:val="center"/>
+            </w:pPr>
+            <w:sdt>
+              <w:sdtPr>
+                <w:rPr>
+                  <w:b/>
+                  <w:color w:val="2B2C2E"/>
+                  <w:sz w:val="17"/>
+                </w:rPr>
+                <w:alias w:val="Resultado"/>
+                <w:tag w:val="resultado"/>
+                <w:id w:val="1091"/>
+                <w:lock w:val="sdtLocked"/>
+                <w:showingPlcHdr/>
+                <w:dropDownList>
+                  <w:listItem w:displayText="AP" w:value="AP"/>
+                  <w:listItem w:displayText="APC" w:value="APC"/>
+                  <w:listItem w:displayText="NAP" w:value="NAP"/>
+                  <w:listItem w:displayText="NR" w:value="NR"/>
+                  <w:listItem w:displayText="R" w:value="R"/>
+                  <w:listItem w:displayText="AL" w:value="AL"/>
+                  <w:listItem w:displayText="AU" w:value="AU"/>
+                  <w:listItem w:displayText="NAU" w:value="NAU"/>
+                  <w:listItem w:displayText="IMP" w:value="IMP"/>
+                  <w:listItem w:displayText="N/A" w:value="N/A"/>
+                </w:dropDownList>
+              </w:sdtPr>
+              <w:sdtContent>
+                <w:r>
+                  <w:rPr>
+                    <w:b/>
+                    <w:i/>
+                    <w:color w:val="8A8B8E"/>
+                    <w:sz w:val="17"/>
+                  </w:rPr>
+                  <w:t xml:space="preserve">Escolher ▾</w:t>
+                </w:r>
+              </w:sdtContent>
+            </w:sdt>
+          </w:p>
+        </w:tc>
+      </w:tr>
+      <w:tr>
+        <w:trPr>
+          <w:trHeight w:val="283"/>
+        </w:trPr>
+        <w:tc>
+          <w:tcPr>
+            <w:tcW w:type="dxa" w:w="5669"/>
+            <w:vAlign w:val="center"/>
+          </w:tcPr>
+          <w:p>
+            <w:pPr>
+              <w:spacing w:after="0"/>
+            </w:pPr>
+            <w:sdt>
+              <w:sdtPr>
+                <w:rPr>
+                  <w:color w:val="2B2C2E"/>
+                  <w:sz w:val="18"/>
+                </w:rPr>
+                <w:alias w:val="Ensaio testemunhado"/>
+                <w:tag w:val="ensaio_testemunhado"/>
                 <w:id w:val="1092"/>
                 <w:lock w:val="sdtLocked"/>
                 <w:comboBox>
@@ -7701,7 +7874,7 @@
                     <w:color w:val="2B2C2E"/>
                     <w:sz w:val="18"/>
                   </w:rPr>
-                  <w:t xml:space="preserve">Fator de potência do isolamento e capacitância das buchas</w:t>
+                  <w:t xml:space="preserve">Resistência de isolamento dos enrolamentos</w:t>
                 </w:r>
               </w:sdtContent>
             </w:sdt>
@@ -7880,7 +8053,7 @@
                     <w:color w:val="2B2C2E"/>
                     <w:sz w:val="18"/>
                   </w:rPr>
-                  <w:t xml:space="preserve">Resistência de isolamento dos enrolamentos</w:t>
+                  <w:t xml:space="preserve">Resistência de isolamento do núcleo</w:t>
                 </w:r>
               </w:sdtContent>
             </w:sdt>
@@ -8059,7 +8232,7 @@
                     <w:color w:val="2B2C2E"/>
                     <w:sz w:val="18"/>
                   </w:rPr>
-                  <w:t xml:space="preserve">Resistência de isolamento do núcleo</w:t>
+                  <w:t xml:space="preserve">Relação de transformação: AT × BT; BT × terciário; AT × terciário</w:t>
                 </w:r>
               </w:sdtContent>
             </w:sdt>
@@ -8238,7 +8411,7 @@
                     <w:color w:val="2B2C2E"/>
                     <w:sz w:val="18"/>
                   </w:rPr>
-                  <w:t xml:space="preserve">Relação de transformação: AT × BT; BT × terciário; AT × terciário</w:t>
+                  <w:t xml:space="preserve">Resistência ôhmica dos enrolamentos de AT, BT e terciário</w:t>
                 </w:r>
               </w:sdtContent>
             </w:sdt>
@@ -8417,7 +8590,7 @@
                     <w:color w:val="2B2C2E"/>
                     <w:sz w:val="18"/>
                   </w:rPr>
-                  <w:t xml:space="preserve">Resistência ôhmica dos enrolamentos de AT, BT e terciário</w:t>
+                  <w:t xml:space="preserve">Relação de transformação dos TCs</w:t>
                 </w:r>
               </w:sdtContent>
             </w:sdt>
@@ -8596,7 +8769,7 @@
                     <w:color w:val="2B2C2E"/>
                     <w:sz w:val="18"/>
                   </w:rPr>
-                  <w:t xml:space="preserve">Relação de transformação dos TCs</w:t>
+                  <w:t xml:space="preserve">Resistência de enrolamento dos TCs</w:t>
                 </w:r>
               </w:sdtContent>
             </w:sdt>
@@ -8775,7 +8948,7 @@
                     <w:color w:val="2B2C2E"/>
                     <w:sz w:val="18"/>
                   </w:rPr>
-                  <w:t xml:space="preserve">Resistência de enrolamento dos TCs</w:t>
+                  <w:t xml:space="preserve">Resistência de isolamento dos TCs</w:t>
                 </w:r>
               </w:sdtContent>
             </w:sdt>
@@ -8888,6 +9061,7 @@
                 <w:tag w:val="ensaio_testemunhado"/>
                 <w:id w:val="1113"/>
                 <w:lock w:val="sdtLocked"/>
+                <w:showingPlcHdr/>
                 <w:comboBox>
                   <w:listItem w:displayText="Fator de potência do isolamento e capacitância das buchas" w:value="Fator de potência do isolamento e capacitância das buchas"/>
                   <w:listItem w:displayText="Resistência de isolamento dos enrolamentos" w:value="Resistência de isolamento dos enrolamentos"/>
@@ -8951,10 +9125,11 @@
               <w:sdtContent>
                 <w:r>
                   <w:rPr>
-                    <w:color w:val="2B2C2E"/>
+                    <w:i/>
+                    <w:color w:val="8A8B8E"/>
                     <w:sz w:val="18"/>
                   </w:rPr>
-                  <w:t xml:space="preserve">Resistência de isolamento dos TCs</w:t>
+                  <w:t xml:space="preserve">Escolher ou digitar o ensaio ▾</w:t>
                 </w:r>
               </w:sdtContent>
             </w:sdt>
@@ -9225,187 +9400,6 @@
           </w:p>
         </w:tc>
       </w:tr>
-      <w:tr>
-        <w:trPr>
-          <w:trHeight w:val="283"/>
-        </w:trPr>
-        <w:tc>
-          <w:tcPr>
-            <w:tcW w:type="dxa" w:w="5669"/>
-            <w:vAlign w:val="center"/>
-          </w:tcPr>
-          <w:p>
-            <w:pPr>
-              <w:spacing w:after="0"/>
-            </w:pPr>
-            <w:sdt>
-              <w:sdtPr>
-                <w:rPr>
-                  <w:color w:val="2B2C2E"/>
-                  <w:sz w:val="18"/>
-                </w:rPr>
-                <w:alias w:val="Ensaio testemunhado"/>
-                <w:tag w:val="ensaio_testemunhado"/>
-                <w:id w:val="1119"/>
-                <w:lock w:val="sdtLocked"/>
-                <w:showingPlcHdr/>
-                <w:comboBox>
-                  <w:listItem w:displayText="Fator de potência do isolamento e capacitância das buchas" w:value="Fator de potência do isolamento e capacitância das buchas"/>
-                  <w:listItem w:displayText="Resistência de isolamento dos enrolamentos" w:value="Resistência de isolamento dos enrolamentos"/>
-                  <w:listItem w:displayText="Resistência de isolamento do núcleo" w:value="Resistência de isolamento do núcleo"/>
-                  <w:listItem w:displayText="Relação de transformação: AT × BT; BT × terciário; AT × terciário" w:value="Relação de transformação: AT × BT; BT × terciário; AT × terciário"/>
-                  <w:listItem w:displayText="Resistência ôhmica dos enrolamentos de AT, BT e terciário" w:value="Resistência ôhmica dos enrolamentos de AT, BT e terciário"/>
-                  <w:listItem w:displayText="Relação de transformação dos TCs" w:value="Relação de transformação dos TCs"/>
-                  <w:listItem w:displayText="Resistência de enrolamento dos TCs" w:value="Resistência de enrolamento dos TCs"/>
-                  <w:listItem w:displayText="Resistência de isolamento dos TCs" w:value="Resistência de isolamento dos TCs"/>
-                  <w:listItem w:displayText="Aspecto visual" w:value="Aspecto visual"/>
-                  <w:listItem w:displayText="Dimensional" w:value="Dimensional"/>
-                  <w:listItem w:displayText="Resistência dos enrolamentos em todas as derivações do CDC" w:value="Resistência dos enrolamentos em todas as derivações do CDC"/>
-                  <w:listItem w:displayText="Relação de transformação" w:value="Relação de transformação"/>
-                  <w:listItem w:displayText="Polaridade" w:value="Polaridade"/>
-                  <w:listItem w:displayText="Deslocamento angular" w:value="Deslocamento angular"/>
-                  <w:listItem w:displayText="Sequência de fases" w:value="Sequência de fases"/>
-                  <w:listItem w:displayText="Resistência de isolamento do núcleo e armadura" w:value="Resistência de isolamento do núcleo e armadura"/>
-                  <w:listItem w:displayText="Perdas em carga e impedância de curto-circuito com ciclo de comutação" w:value="Perdas em carga e impedância de curto-circuito com ciclo de comutação"/>
-                  <w:listItem w:displayText="Perdas em vazio e corrente de excitação" w:value="Perdas em vazio e corrente de excitação"/>
-                  <w:listItem w:displayText="Perdas em vazio e corrente de excitação (antes dos dielétricos)" w:value="Perdas em vazio e corrente de excitação (antes dos dielétricos)"/>
-                  <w:listItem w:displayText="Perdas em vazio e corrente de excitação (após os dielétricos) com ciclo de comutação a vazio" w:value="Perdas em vazio e corrente de excitação (após os dielétricos) com ciclo de comutação a vazio"/>
-                  <w:listItem w:displayText="Levantamento da curva de saturação" w:value="Levantamento da curva de saturação"/>
-                  <w:listItem w:displayText="Impulso atmosférico alta tensão e H0" w:value="Impulso atmosférico alta tensão e H0"/>
-                  <w:listItem w:displayText="Impulso atmosférico baixa tensão e X0" w:value="Impulso atmosférico baixa tensão e X0"/>
-                  <w:listItem w:displayText="Impulso atmosférico terciário" w:value="Impulso atmosférico terciário"/>
-                  <w:listItem w:displayText="Impulso de manobra" w:value="Impulso de manobra"/>
-                  <w:listItem w:displayText="Tensão induzida de longa duração com medição de descargas parciais" w:value="Tensão induzida de longa duração com medição de descargas parciais"/>
-                  <w:listItem w:displayText="Tensão aplicada à frequência industrial" w:value="Tensão aplicada à frequência industrial"/>
-                  <w:listItem w:displayText="Estanqueidade e resistência à pressão" w:value="Estanqueidade e resistência à pressão"/>
-                  <w:listItem w:displayText="Capacitância entre enrolamentos e terra e entre enrolamentos (fator de potência)" w:value="Capacitância entre enrolamentos e terra e entre enrolamentos (fator de potência)"/>
-                  <w:listItem w:displayText="Capacitância e fator de potência das buchas" w:value="Capacitância e fator de potência das buchas"/>
-                  <w:listItem w:displayText="Resposta em frequência" w:value="Resposta em frequência"/>
-                  <w:listItem w:displayText="Impedância terminal" w:value="Impedância terminal"/>
-                  <w:listItem w:displayText="Ponto de orvalho (URSI)" w:value="Ponto de orvalho (URSI)"/>
-                  <w:listItem w:displayText="Vácuo e deformação" w:value="Vácuo e deformação"/>
-                  <w:listItem w:displayText="Relação de transformação" w:value="Relação de transformação"/>
-                  <w:listItem w:displayText="Polaridade" w:value="Polaridade"/>
-                  <w:listItem w:displayText="Resistência elétrica dos enrolamentos" w:value="Resistência elétrica dos enrolamentos"/>
-                  <w:listItem w:displayText="Tensão aplicada à frequência industrial" w:value="Tensão aplicada à frequência industrial"/>
-                  <w:listItem w:displayText="Resistência de isolamento" w:value="Resistência de isolamento"/>
-                  <w:listItem w:displayText="Aspecto dos acessórios e fiação" w:value="Aspecto dos acessórios e fiação"/>
-                  <w:listItem w:displayText="Funcional dos acessórios" w:value="Funcional dos acessórios"/>
-                  <w:listItem w:displayText="Tensão aplicada à frequência industrial nos componentes e circuitos" w:value="Tensão aplicada à frequência industrial nos componentes e circuitos"/>
-                  <w:listItem w:displayText="Continuidade dos circuitos elétricos de comando, controle, proteção e medição" w:value="Continuidade dos circuitos elétricos de comando, controle, proteção e medição"/>
-                  <w:listItem w:displayText="Funcional do comutador" w:value="Funcional do comutador"/>
-                  <w:listItem w:displayText="Resistência de isolamento" w:value="Resistência de isolamento"/>
-                  <w:listItem w:displayText="Endereçamento da fiação (anilhamento)" w:value="Endereçamento da fiação (anilhamento)"/>
-                  <w:listItem w:displayText="Ajuste da imagem térmica" w:value="Ajuste da imagem térmica"/>
-                  <w:listItem w:displayText="Verificação dimensional" w:value="Verificação dimensional"/>
-                  <w:listItem w:displayText="Verificação da lista de materiais" w:value="Verificação da lista de materiais"/>
-                  <w:listItem w:displayText="Verificação da aderência da camada de pintura" w:value="Verificação da aderência da camada de pintura"/>
-                  <w:listItem w:displayText="Verificação da espessura total da camada de pintura" w:value="Verificação da espessura total da camada de pintura"/>
-                  <w:listItem w:displayText="Físico-químico – inicial" w:value="Físico-químico – inicial"/>
-                  <w:listItem w:displayText="Físico-químico – final" w:value="Físico-químico – final"/>
-                  <w:listItem w:displayText="Cromatografia – antes dos dielétricos" w:value="Cromatografia – antes dos dielétricos"/>
-                  <w:listItem w:displayText="Cromatografia – após os dielétricos" w:value="Cromatografia – após os dielétricos"/>
-                  <w:listItem w:displayText="Espessura de película seca" w:value="Espessura de película seca"/>
-                  <w:listItem w:displayText="Aderência" w:value="Aderência"/>
-                </w:comboBox>
-              </w:sdtPr>
-              <w:sdtContent>
-                <w:r>
-                  <w:rPr>
-                    <w:i/>
-                    <w:color w:val="8A8B8E"/>
-                    <w:sz w:val="18"/>
-                  </w:rPr>
-                  <w:t xml:space="preserve">Escolher ou digitar o ensaio ▾</w:t>
-                </w:r>
-              </w:sdtContent>
-            </w:sdt>
-          </w:p>
-        </w:tc>
-        <w:tc>
-          <w:tcPr>
-            <w:tcW w:type="dxa" w:w="2381"/>
-            <w:vAlign w:val="center"/>
-          </w:tcPr>
-          <w:p>
-            <w:pPr>
-              <w:spacing w:after="0"/>
-            </w:pPr>
-            <w:sdt>
-              <w:sdtPr>
-                <w:rPr>
-                  <w:color w:val="2B2C2E"/>
-                  <w:sz w:val="18"/>
-                </w:rPr>
-                <w:alias w:val="Evidência"/>
-                <w:tag w:val="evidência"/>
-                <w:id w:val="1120"/>
-                <w:lock w:val="sdtLocked"/>
-                <w:showingPlcHdr/>
-                <w:text/>
-              </w:sdtPr>
-              <w:sdtContent>
-                <w:r>
-                  <w:rPr>
-                    <w:i/>
-                    <w:color w:val="8A8B8E"/>
-                    <w:sz w:val="18"/>
-                  </w:rPr>
-                  <w:t xml:space="preserve">Foto nº / boletim</w:t>
-                </w:r>
-              </w:sdtContent>
-            </w:sdt>
-          </w:p>
-        </w:tc>
-        <w:tc>
-          <w:tcPr>
-            <w:tcW w:type="dxa" w:w="1587"/>
-            <w:vAlign w:val="center"/>
-          </w:tcPr>
-          <w:p>
-            <w:pPr>
-              <w:jc w:val="center"/>
-            </w:pPr>
-            <w:sdt>
-              <w:sdtPr>
-                <w:rPr>
-                  <w:b/>
-                  <w:color w:val="2B2C2E"/>
-                  <w:sz w:val="17"/>
-                </w:rPr>
-                <w:alias w:val="Resultado"/>
-                <w:tag w:val="resultado"/>
-                <w:id w:val="1121"/>
-                <w:lock w:val="sdtLocked"/>
-                <w:showingPlcHdr/>
-                <w:dropDownList>
-                  <w:listItem w:displayText="AP" w:value="AP"/>
-                  <w:listItem w:displayText="APC" w:value="APC"/>
-                  <w:listItem w:displayText="NAP" w:value="NAP"/>
-                  <w:listItem w:displayText="NR" w:value="NR"/>
-                  <w:listItem w:displayText="R" w:value="R"/>
-                  <w:listItem w:displayText="AL" w:value="AL"/>
-                  <w:listItem w:displayText="AU" w:value="AU"/>
-                  <w:listItem w:displayText="NAU" w:value="NAU"/>
-                  <w:listItem w:displayText="IMP" w:value="IMP"/>
-                  <w:listItem w:displayText="N/A" w:value="N/A"/>
-                </w:dropDownList>
-              </w:sdtPr>
-              <w:sdtContent>
-                <w:r>
-                  <w:rPr>
-                    <w:b/>
-                    <w:i/>
-                    <w:color w:val="8A8B8E"/>
-                    <w:sz w:val="17"/>
-                  </w:rPr>
-                  <w:t xml:space="preserve">Escolher ▾</w:t>
-                </w:r>
-              </w:sdtContent>
-            </w:sdt>
-          </w:p>
-        </w:tc>
-      </w:tr>
     </w:tbl>
     <w:p>
       <w:pPr>
@@ -9545,7 +9539,7 @@
                 </w:rPr>
                 <w:alias w:val="Data dos ensaios"/>
                 <w:tag w:val="data_dos_ensaios"/>
-                <w:id w:val="1122"/>
+                <w:id w:val="1119"/>
                 <w:lock w:val="sdtLocked"/>
                 <w:showingPlcHdr/>
                 <w:date>
@@ -9584,7 +9578,7 @@
                 </w:rPr>
                 <w:alias w:val="Resultado do parecer"/>
                 <w:tag w:val="resultado_do_parecer"/>
-                <w:id w:val="1123"/>
+                <w:id w:val="1120"/>
                 <w:lock w:val="sdtLocked"/>
                 <w:showingPlcHdr/>
                 <w:dropDownList>
@@ -9622,7 +9616,7 @@
                 </w:rPr>
                 <w:alias w:val="Observações do parecer"/>
                 <w:tag w:val="observações_do_parecer"/>
-                <w:id w:val="1124"/>
+                <w:id w:val="1121"/>
                 <w:lock w:val="sdtLocked"/>
                 <w:showingPlcHdr/>
                 <w:text/>
@@ -9770,7 +9764,7 @@
               <w:sdtPr>
                 <w:alias w:val="Foto"/>
                 <w:tag w:val="foto"/>
-                <w:id w:val="1125"/>
+                <w:id w:val="1122"/>
                 <w:lock w:val="sdtLocked"/>
                 <w:showingPlcHdr/>
                 <w:picture/>
@@ -9827,7 +9821,7 @@
               <w:sdtPr>
                 <w:alias w:val="Foto"/>
                 <w:tag w:val="foto"/>
-                <w:id w:val="1127"/>
+                <w:id w:val="1124"/>
                 <w:lock w:val="sdtLocked"/>
                 <w:showingPlcHdr/>
                 <w:picture/>
@@ -9899,7 +9893,7 @@
                 </w:rPr>
                 <w:alias w:val="Legenda foto 1"/>
                 <w:tag w:val="legenda_foto_1"/>
-                <w:id w:val="1126"/>
+                <w:id w:val="1123"/>
                 <w:lock w:val="sdtLocked"/>
                 <w:showingPlcHdr/>
                 <w:text/>
@@ -9943,7 +9937,7 @@
                 </w:rPr>
                 <w:alias w:val="Legenda foto 2"/>
                 <w:tag w:val="legenda_foto_2"/>
-                <w:id w:val="1128"/>
+                <w:id w:val="1125"/>
                 <w:lock w:val="sdtLocked"/>
                 <w:showingPlcHdr/>
                 <w:text/>
@@ -9979,7 +9973,7 @@
               <w:sdtPr>
                 <w:alias w:val="Foto"/>
                 <w:tag w:val="foto"/>
-                <w:id w:val="1129"/>
+                <w:id w:val="1126"/>
                 <w:lock w:val="sdtLocked"/>
                 <w:showingPlcHdr/>
                 <w:picture/>
@@ -10036,7 +10030,7 @@
               <w:sdtPr>
                 <w:alias w:val="Foto"/>
                 <w:tag w:val="foto"/>
-                <w:id w:val="1131"/>
+                <w:id w:val="1128"/>
                 <w:lock w:val="sdtLocked"/>
                 <w:showingPlcHdr/>
                 <w:picture/>
@@ -10108,7 +10102,7 @@
                 </w:rPr>
                 <w:alias w:val="Legenda foto 3"/>
                 <w:tag w:val="legenda_foto_3"/>
-                <w:id w:val="1130"/>
+                <w:id w:val="1127"/>
                 <w:lock w:val="sdtLocked"/>
                 <w:showingPlcHdr/>
                 <w:text/>
@@ -10152,7 +10146,7 @@
                 </w:rPr>
                 <w:alias w:val="Legenda foto 4"/>
                 <w:tag w:val="legenda_foto_4"/>
-                <w:id w:val="1132"/>
+                <w:id w:val="1129"/>
                 <w:lock w:val="sdtLocked"/>
                 <w:showingPlcHdr/>
                 <w:text/>
@@ -10188,7 +10182,7 @@
               <w:sdtPr>
                 <w:alias w:val="Foto"/>
                 <w:tag w:val="foto"/>
-                <w:id w:val="1133"/>
+                <w:id w:val="1130"/>
                 <w:lock w:val="sdtLocked"/>
                 <w:showingPlcHdr/>
                 <w:picture/>
@@ -10245,7 +10239,7 @@
               <w:sdtPr>
                 <w:alias w:val="Foto"/>
                 <w:tag w:val="foto"/>
-                <w:id w:val="1135"/>
+                <w:id w:val="1132"/>
                 <w:lock w:val="sdtLocked"/>
                 <w:showingPlcHdr/>
                 <w:picture/>
@@ -10317,7 +10311,7 @@
                 </w:rPr>
                 <w:alias w:val="Legenda foto 5"/>
                 <w:tag w:val="legenda_foto_5"/>
-                <w:id w:val="1134"/>
+                <w:id w:val="1131"/>
                 <w:lock w:val="sdtLocked"/>
                 <w:showingPlcHdr/>
                 <w:text/>
@@ -10361,7 +10355,7 @@
                 </w:rPr>
                 <w:alias w:val="Legenda foto 6"/>
                 <w:tag w:val="legenda_foto_6"/>
-                <w:id w:val="1136"/>
+                <w:id w:val="1133"/>
                 <w:lock w:val="sdtLocked"/>
                 <w:showingPlcHdr/>
                 <w:text/>
@@ -10650,7 +10644,7 @@
                 </w:rPr>
                 <w:alias w:val="Data rev. 00"/>
                 <w:tag w:val="data_rev._00"/>
-                <w:id w:val="1137"/>
+                <w:id w:val="1134"/>
                 <w:lock w:val="sdtLocked"/>
                 <w:showingPlcHdr/>
                 <w:date>
@@ -10710,7 +10704,7 @@
                 </w:rPr>
                 <w:alias w:val="Elaborado rev. 00"/>
                 <w:tag w:val="elaborado_rev._00"/>
-                <w:id w:val="1138"/>
+                <w:id w:val="1135"/>
                 <w:lock w:val="sdtLocked"/>
                 <w:showingPlcHdr/>
                 <w:text/>
@@ -10745,7 +10739,7 @@
                 </w:rPr>
                 <w:alias w:val="Aprovado rev. 00"/>
                 <w:tag w:val="aprovado_rev._00"/>
-                <w:id w:val="1139"/>
+                <w:id w:val="1136"/>
                 <w:lock w:val="sdtLocked"/>
                 <w:showingPlcHdr/>
                 <w:text/>
@@ -10785,7 +10779,7 @@
                 </w:rPr>
                 <w:alias w:val="Rev."/>
                 <w:tag w:val="rev."/>
-                <w:id w:val="1140"/>
+                <w:id w:val="1137"/>
                 <w:lock w:val="sdtLocked"/>
                 <w:showingPlcHdr/>
                 <w:text/>
@@ -10820,7 +10814,7 @@
                 </w:rPr>
                 <w:alias w:val="Data rev."/>
                 <w:tag w:val="data_rev."/>
-                <w:id w:val="1141"/>
+                <w:id w:val="1138"/>
                 <w:lock w:val="sdtLocked"/>
                 <w:showingPlcHdr/>
                 <w:date>
@@ -10860,7 +10854,7 @@
                 </w:rPr>
                 <w:alias w:val="Descrição rev."/>
                 <w:tag w:val="descrição_rev."/>
-                <w:id w:val="1142"/>
+                <w:id w:val="1139"/>
                 <w:lock w:val="sdtLocked"/>
                 <w:showingPlcHdr/>
                 <w:text/>
@@ -10895,7 +10889,7 @@
                 </w:rPr>
                 <w:alias w:val="Elaborado rev."/>
                 <w:tag w:val="elaborado_rev."/>
-                <w:id w:val="1143"/>
+                <w:id w:val="1140"/>
                 <w:lock w:val="sdtLocked"/>
                 <w:showingPlcHdr/>
                 <w:text/>
@@ -10930,7 +10924,7 @@
                 </w:rPr>
                 <w:alias w:val="Aprovado rev."/>
                 <w:tag w:val="aprovado_rev."/>
-                <w:id w:val="1144"/>
+                <w:id w:val="1141"/>
                 <w:lock w:val="sdtLocked"/>
                 <w:showingPlcHdr/>
                 <w:text/>
@@ -11097,51 +11091,6 @@
             <w:top w:val="single" w:sz="6" w:color="C9CACC"/>
           </w:tcBorders>
         </w:tcPr>
-        <w:p>
-          <w:pPr>
-            <w:jc w:val="right"/>
-          </w:pPr>
-          <w:r>
-            <w:rPr>
-              <w:b w:val="0"/>
-              <w:color w:val="5F6064"/>
-              <w:sz w:val="13"/>
-            </w:rPr>
-            <w:fldChar w:fldCharType="begin"/>
-          </w:r>
-          <w:r>
-            <w:rPr>
-              <w:b w:val="0"/>
-              <w:color w:val="5F6064"/>
-              <w:sz w:val="13"/>
-            </w:rPr>
-            <w:instrText xml:space="preserve"> REF RCF_NUMERO \* MERGEFORMAT </w:instrText>
-          </w:r>
-          <w:r>
-            <w:rPr>
-              <w:b w:val="0"/>
-              <w:color w:val="5F6064"/>
-              <w:sz w:val="13"/>
-            </w:rPr>
-            <w:fldChar w:fldCharType="separate"/>
-          </w:r>
-          <w:r>
-            <w:rPr>
-              <w:b w:val="0"/>
-              <w:color w:val="5F6064"/>
-              <w:sz w:val="13"/>
-            </w:rPr>
-            <w:t>RCF-[SIGLA]-[0000]-[AAAA]</w:t>
-          </w:r>
-          <w:r>
-            <w:rPr>
-              <w:b w:val="0"/>
-              <w:color w:val="5F6064"/>
-              <w:sz w:val="13"/>
-            </w:rPr>
-            <w:fldChar w:fldCharType="end"/>
-          </w:r>
-        </w:p>
         <w:p>
           <w:pPr>
             <w:spacing w:after="0" w:before="0"/>
@@ -11463,266 +11412,7 @@
             <w:bottom w:val="single" w:sz="18" w:color="F69138"/>
           </w:tcBorders>
         </w:tcPr>
-        <w:p>
-          <w:pPr>
-            <w:spacing w:after="0" w:before="0"/>
-          </w:pPr>
-          <w:r>
-            <w:rPr>
-              <w:b/>
-              <w:i w:val="0"/>
-              <w:color w:val="2B2C2E"/>
-              <w:sz w:val="16"/>
-            </w:rPr>
-            <w:t xml:space="preserve">Nº </w:t>
-          </w:r>
-          <w:r>
-            <w:rPr>
-              <w:b/>
-              <w:color w:val="2B2C2E"/>
-              <w:sz w:val="16"/>
-            </w:rPr>
-            <w:fldChar w:fldCharType="begin"/>
-          </w:r>
-          <w:r>
-            <w:rPr>
-              <w:b/>
-              <w:color w:val="2B2C2E"/>
-              <w:sz w:val="16"/>
-            </w:rPr>
-            <w:instrText xml:space="preserve"> REF RCF_NUMERO \* MERGEFORMAT </w:instrText>
-          </w:r>
-          <w:r>
-            <w:rPr>
-              <w:b/>
-              <w:color w:val="2B2C2E"/>
-              <w:sz w:val="16"/>
-            </w:rPr>
-            <w:fldChar w:fldCharType="separate"/>
-          </w:r>
-          <w:r>
-            <w:rPr>
-              <w:b/>
-              <w:color w:val="2B2C2E"/>
-              <w:sz w:val="16"/>
-            </w:rPr>
-            <w:t>RCF-[SIGLA]-[0000]-[AAAA]</w:t>
-          </w:r>
-          <w:r>
-            <w:rPr>
-              <w:b/>
-              <w:color w:val="2B2C2E"/>
-              <w:sz w:val="16"/>
-            </w:rPr>
-            <w:fldChar w:fldCharType="end"/>
-          </w:r>
-        </w:p>
-        <w:p>
-          <w:pPr>
-            <w:spacing w:after="0" w:before="0"/>
-          </w:pPr>
-          <w:r>
-            <w:rPr>
-              <w:b w:val="0"/>
-              <w:i w:val="0"/>
-              <w:color w:val="5F6064"/>
-              <w:sz w:val="15"/>
-            </w:rPr>
-            <w:t xml:space="preserve">Rev. </w:t>
-          </w:r>
-          <w:r>
-            <w:rPr>
-              <w:b w:val="0"/>
-              <w:color w:val="2B2C2E"/>
-              <w:sz w:val="15"/>
-            </w:rPr>
-            <w:fldChar w:fldCharType="begin"/>
-          </w:r>
-          <w:r>
-            <w:rPr>
-              <w:b w:val="0"/>
-              <w:color w:val="2B2C2E"/>
-              <w:sz w:val="15"/>
-            </w:rPr>
-            <w:instrText xml:space="preserve"> REF RCF_REVISAO \* MERGEFORMAT </w:instrText>
-          </w:r>
-          <w:r>
-            <w:rPr>
-              <w:b w:val="0"/>
-              <w:color w:val="2B2C2E"/>
-              <w:sz w:val="15"/>
-            </w:rPr>
-            <w:fldChar w:fldCharType="separate"/>
-          </w:r>
-          <w:r>
-            <w:rPr>
-              <w:b w:val="0"/>
-              <w:color w:val="2B2C2E"/>
-              <w:sz w:val="15"/>
-            </w:rPr>
-            <w:t>00</w:t>
-          </w:r>
-          <w:r>
-            <w:rPr>
-              <w:b w:val="0"/>
-              <w:color w:val="2B2C2E"/>
-              <w:sz w:val="15"/>
-            </w:rPr>
-            <w:fldChar w:fldCharType="end"/>
-          </w:r>
-          <w:r>
-            <w:rPr>
-              <w:b w:val="0"/>
-              <w:i w:val="0"/>
-              <w:color w:val="5F6064"/>
-              <w:sz w:val="15"/>
-            </w:rPr>
-            <w:t xml:space="preserve">  ·  Emissão </w:t>
-          </w:r>
-          <w:r>
-            <w:rPr>
-              <w:b w:val="0"/>
-              <w:color w:val="2B2C2E"/>
-              <w:sz w:val="15"/>
-            </w:rPr>
-            <w:fldChar w:fldCharType="begin"/>
-          </w:r>
-          <w:r>
-            <w:rPr>
-              <w:b w:val="0"/>
-              <w:color w:val="2B2C2E"/>
-              <w:sz w:val="15"/>
-            </w:rPr>
-            <w:instrText xml:space="preserve"> REF RCF_EMISSAO \* MERGEFORMAT </w:instrText>
-          </w:r>
-          <w:r>
-            <w:rPr>
-              <w:b w:val="0"/>
-              <w:color w:val="2B2C2E"/>
-              <w:sz w:val="15"/>
-            </w:rPr>
-            <w:fldChar w:fldCharType="separate"/>
-          </w:r>
-          <w:r>
-            <w:rPr>
-              <w:b w:val="0"/>
-              <w:color w:val="2B2C2E"/>
-              <w:sz w:val="15"/>
-            </w:rPr>
-            <w:t>DD/MM/AAAA</w:t>
-          </w:r>
-          <w:r>
-            <w:rPr>
-              <w:b w:val="0"/>
-              <w:color w:val="2B2C2E"/>
-              <w:sz w:val="15"/>
-            </w:rPr>
-            <w:fldChar w:fldCharType="end"/>
-          </w:r>
-        </w:p>
-        <w:p>
-          <w:pPr>
-            <w:spacing w:after="0" w:before="0"/>
-          </w:pPr>
-          <w:r>
-            <w:rPr>
-              <w:b w:val="0"/>
-              <w:i w:val="0"/>
-              <w:color w:val="5F6064"/>
-              <w:sz w:val="15"/>
-            </w:rPr>
-            <w:t xml:space="preserve">Página </w:t>
-          </w:r>
-          <w:r>
-            <w:rPr>
-              <w:b/>
-              <w:color w:val="2B2C2E"/>
-              <w:sz w:val="15"/>
-            </w:rPr>
-            <w:fldChar w:fldCharType="begin"/>
-          </w:r>
-          <w:r>
-            <w:rPr>
-              <w:b/>
-              <w:color w:val="2B2C2E"/>
-              <w:sz w:val="15"/>
-            </w:rPr>
-            <w:instrText xml:space="preserve"> PAGE </w:instrText>
-          </w:r>
-          <w:r>
-            <w:rPr>
-              <w:b/>
-              <w:color w:val="2B2C2E"/>
-              <w:sz w:val="15"/>
-            </w:rPr>
-            <w:fldChar w:fldCharType="separate"/>
-          </w:r>
-          <w:r>
-            <w:rPr>
-              <w:b/>
-              <w:color w:val="2B2C2E"/>
-              <w:sz w:val="15"/>
-            </w:rPr>
-            <w:t>1</w:t>
-          </w:r>
-          <w:r>
-            <w:rPr>
-              <w:b/>
-              <w:color w:val="2B2C2E"/>
-              <w:sz w:val="15"/>
-            </w:rPr>
-            <w:fldChar w:fldCharType="end"/>
-          </w:r>
-          <w:r>
-            <w:rPr>
-              <w:b w:val="0"/>
-              <w:i w:val="0"/>
-              <w:color w:val="5F6064"/>
-              <w:sz w:val="15"/>
-            </w:rPr>
-            <w:t xml:space="preserve"> de </w:t>
-          </w:r>
-          <w:r>
-            <w:rPr>
-              <w:b/>
-              <w:color w:val="2B2C2E"/>
-              <w:sz w:val="15"/>
-            </w:rPr>
-            <w:fldChar w:fldCharType="begin"/>
-          </w:r>
-          <w:r>
-            <w:rPr>
-              <w:b/>
-              <w:color w:val="2B2C2E"/>
-              <w:sz w:val="15"/>
-            </w:rPr>
-            <w:instrText xml:space="preserve"> NUMPAGES </w:instrText>
-          </w:r>
-          <w:r>
-            <w:rPr>
-              <w:b/>
-              <w:color w:val="2B2C2E"/>
-              <w:sz w:val="15"/>
-            </w:rPr>
-            <w:fldChar w:fldCharType="separate"/>
-          </w:r>
-          <w:r>
-            <w:rPr>
-              <w:b/>
-              <w:color w:val="2B2C2E"/>
-              <w:sz w:val="15"/>
-            </w:rPr>
-            <w:t>1</w:t>
-          </w:r>
-          <w:r>
-            <w:rPr>
-              <w:b/>
-              <w:color w:val="2B2C2E"/>
-              <w:sz w:val="15"/>
-            </w:rPr>
-            <w:fldChar w:fldCharType="end"/>
-          </w:r>
-        </w:p>
+        <w:p/>
       </w:tc>
     </w:tr>
   </w:tbl>

</xml_diff>